<commit_message>
Konsenz: zdravstvo brez stopnic, zemljevid samo kje, prevoz, storitve/ohladitev
Umaknjeno podvajanje stopnic/dvigala iz koraka Zdravstvo (ostane pri 65+).
Zemljevid za izbrane težave vpraša samo kje. Dodan dnevni prevoz ter kratek
neobvezen sklop storitev in ohladitve. Usklajen Code.gs in papirni Word.
</commit_message>
<xml_diff>
--- a/savska-anketa-papir.docx
+++ b/savska-anketa-papir.docx
@@ -826,7 +826,7 @@
         <w:keepNext/>
       </w:pPr>
       <w:r>
-        <w:t>5. Kaj je problem in kje?</w:t>
+        <w:t>5. Kje so te težave?</w:t>
       </w:r>
     </w:p>
     <w:p>
@@ -845,7 +845,7 @@
           <w:b w:val="0"/>
           <w:i w:val="0"/>
         </w:rPr>
-        <w:t>Na kratko: kaj vas moti in kje v naselju. Lahko tudi preskočite. Največ 5 problemov.</w:t>
+        <w:t>Za težave, ki ste jih izbrali v 3. koraku, označite kraj. Tema je že izbrana – tu samo kje. Lahko tudi preskočite.</w:t>
       </w:r>
     </w:p>
     <w:p>
@@ -857,7 +857,7 @@
           <w:b/>
           <w:i w:val="0"/>
         </w:rPr>
-        <w:t>Problem 1</w:t>
+        <w:t>Težava 1 (napišite, katero ste izbrali v 3. koraku): ______________________</w:t>
       </w:r>
     </w:p>
     <w:p>
@@ -866,16 +866,7 @@
           <w:b w:val="0"/>
           <w:i w:val="0"/>
         </w:rPr>
-        <w:t>Kaj je problem? __________________________________________________________________</w:t>
-      </w:r>
-    </w:p>
-    <w:p>
-      <w:r>
-        <w:rPr>
-          <w:b w:val="0"/>
-          <w:i w:val="0"/>
-        </w:rPr>
-        <w:t>Ulica / kraj: _____________________________________________________________________</w:t>
+        <w:t>Kje (ulica / kraj / št. na zemljevidu): _________________________________</w:t>
       </w:r>
     </w:p>
     <w:p>
@@ -888,6 +879,14 @@
       </w:r>
     </w:p>
     <w:p>
+      <w:r>
+        <w:rPr>
+          <w:b w:val="0"/>
+          <w:i w:val="0"/>
+        </w:rPr>
+      </w:r>
+    </w:p>
+    <w:p>
       <w:pPr>
         <w:spacing w:before="120"/>
       </w:pPr>
@@ -896,7 +895,7 @@
           <w:b/>
           <w:i w:val="0"/>
         </w:rPr>
-        <w:t>Problem 2</w:t>
+        <w:t>Težava 2 (napišite, katero ste izbrali v 3. koraku): ______________________</w:t>
       </w:r>
     </w:p>
     <w:p>
@@ -905,16 +904,7 @@
           <w:b w:val="0"/>
           <w:i w:val="0"/>
         </w:rPr>
-        <w:t>Kaj je problem? __________________________________________________________________</w:t>
-      </w:r>
-    </w:p>
-    <w:p>
-      <w:r>
-        <w:rPr>
-          <w:b w:val="0"/>
-          <w:i w:val="0"/>
-        </w:rPr>
-        <w:t>Ulica / kraj: _____________________________________________________________________</w:t>
+        <w:t>Kje (ulica / kraj / št. na zemljevidu): _________________________________</w:t>
       </w:r>
     </w:p>
     <w:p>
@@ -927,6 +917,14 @@
       </w:r>
     </w:p>
     <w:p>
+      <w:r>
+        <w:rPr>
+          <w:b w:val="0"/>
+          <w:i w:val="0"/>
+        </w:rPr>
+      </w:r>
+    </w:p>
+    <w:p>
       <w:pPr>
         <w:spacing w:before="120"/>
       </w:pPr>
@@ -935,7 +933,7 @@
           <w:b/>
           <w:i w:val="0"/>
         </w:rPr>
-        <w:t>Problem 3</w:t>
+        <w:t>Težava 3 (napišite, katero ste izbrali v 3. koraku): ______________________</w:t>
       </w:r>
     </w:p>
     <w:p>
@@ -944,16 +942,7 @@
           <w:b w:val="0"/>
           <w:i w:val="0"/>
         </w:rPr>
-        <w:t>Kaj je problem? __________________________________________________________________</w:t>
-      </w:r>
-    </w:p>
-    <w:p>
-      <w:r>
-        <w:rPr>
-          <w:b w:val="0"/>
-          <w:i w:val="0"/>
-        </w:rPr>
-        <w:t>Ulica / kraj: _____________________________________________________________________</w:t>
+        <w:t>Kje (ulica / kraj / št. na zemljevidu): _________________________________</w:t>
       </w:r>
     </w:p>
     <w:p>
@@ -966,6 +955,14 @@
       </w:r>
     </w:p>
     <w:p>
+      <w:r>
+        <w:rPr>
+          <w:b w:val="0"/>
+          <w:i w:val="0"/>
+        </w:rPr>
+      </w:r>
+    </w:p>
+    <w:p>
       <w:pPr>
         <w:spacing w:before="120"/>
       </w:pPr>
@@ -974,7 +971,7 @@
           <w:b/>
           <w:i w:val="0"/>
         </w:rPr>
-        <w:t>Problem 4</w:t>
+        <w:t>Težava 4 (napišite, katero ste izbrali v 3. koraku): ______________________</w:t>
       </w:r>
     </w:p>
     <w:p>
@@ -983,16 +980,7 @@
           <w:b w:val="0"/>
           <w:i w:val="0"/>
         </w:rPr>
-        <w:t>Kaj je problem? __________________________________________________________________</w:t>
-      </w:r>
-    </w:p>
-    <w:p>
-      <w:r>
-        <w:rPr>
-          <w:b w:val="0"/>
-          <w:i w:val="0"/>
-        </w:rPr>
-        <w:t>Ulica / kraj: _____________________________________________________________________</w:t>
+        <w:t>Kje (ulica / kraj / št. na zemljevidu): _________________________________</w:t>
       </w:r>
     </w:p>
     <w:p>
@@ -1005,6 +993,14 @@
       </w:r>
     </w:p>
     <w:p>
+      <w:r>
+        <w:rPr>
+          <w:b w:val="0"/>
+          <w:i w:val="0"/>
+        </w:rPr>
+      </w:r>
+    </w:p>
+    <w:p>
       <w:pPr>
         <w:spacing w:before="120"/>
       </w:pPr>
@@ -1013,7 +1009,7 @@
           <w:b/>
           <w:i w:val="0"/>
         </w:rPr>
-        <w:t>Problem 5</w:t>
+        <w:t>Težava 5 (napišite, katero ste izbrali v 3. koraku): ______________________</w:t>
       </w:r>
     </w:p>
     <w:p>
@@ -1022,16 +1018,7 @@
           <w:b w:val="0"/>
           <w:i w:val="0"/>
         </w:rPr>
-        <w:t>Kaj je problem? __________________________________________________________________</w:t>
-      </w:r>
-    </w:p>
-    <w:p>
-      <w:r>
-        <w:rPr>
-          <w:b w:val="0"/>
-          <w:i w:val="0"/>
-        </w:rPr>
-        <w:t>Ulica / kraj: _____________________________________________________________________</w:t>
+        <w:t>Kje (ulica / kraj / št. na zemljevidu): _________________________________</w:t>
       </w:r>
     </w:p>
     <w:p>
@@ -1041,6 +1028,14 @@
           <w:i w:val="0"/>
         </w:rPr>
         <w:t>Natančneje (neobvezno): ____________________________________________________</w:t>
+      </w:r>
+    </w:p>
+    <w:p>
+      <w:r>
+        <w:rPr>
+          <w:b w:val="0"/>
+          <w:i w:val="0"/>
+        </w:rPr>
       </w:r>
     </w:p>
     <w:p>
@@ -1432,11 +1427,108 @@
     </w:p>
     <w:p>
       <w:pPr>
+        <w:keepNext/>
+      </w:pPr>
+      <w:r>
+        <w:t>Katero prevozno sredstvo najpogosteje uporabljate za vsakodnevne poti?</w:t>
+      </w:r>
+    </w:p>
+    <w:p>
+      <w:pPr>
+        <w:keepNext/>
+      </w:pPr>
+      <w:r>
+        <w:t>Neobvezno.</w:t>
+      </w:r>
+    </w:p>
+    <w:p>
+      <w:pPr>
+        <w:keepNext/>
+      </w:pPr>
+      <w:r>
+        <w:t>☐  Peš     ☐  Kolo     ☐  JPP (avtobus)     ☐  Avto     ☐  Drugo</w:t>
+      </w:r>
+    </w:p>
+    <w:p>
+      <w:pPr>
         <w:pStyle w:val="Heading2"/>
         <w:keepNext/>
       </w:pPr>
       <w:r>
-        <w:t>8. Upravnik in zbori</w:t>
+        <w:t>8. Storitve v bližini in ohladitev</w:t>
+      </w:r>
+    </w:p>
+    <w:p>
+      <w:pPr>
+        <w:keepNext/>
+      </w:pPr>
+      <w:r>
+        <w:t>Za vse</w:t>
+      </w:r>
+    </w:p>
+    <w:p>
+      <w:pPr>
+        <w:keepNext/>
+      </w:pPr>
+      <w:r>
+        <w:t>Vsa vprašanja so neobvezna.</w:t>
+      </w:r>
+    </w:p>
+    <w:p>
+      <w:pPr>
+        <w:keepNext/>
+      </w:pPr>
+      <w:r>
+        <w:t>Katere storitve v bližini pogrešate? (lahko več)</w:t>
+      </w:r>
+    </w:p>
+    <w:p>
+      <w:pPr>
+        <w:keepNext/>
+      </w:pPr>
+      <w:r>
+        <w:t>☐  Banka     ☐  Pošta     ☐  Trgovina     ☐  Lekarna     ☐  Drugo</w:t>
+      </w:r>
+    </w:p>
+    <w:p>
+      <w:pPr>
+        <w:keepNext/>
+      </w:pPr>
+      <w:r>
+        <w:t>Če drugo – na kratko: ________________________________________________</w:t>
+      </w:r>
+    </w:p>
+    <w:p>
+      <w:pPr>
+        <w:keepNext/>
+      </w:pPr>
+      <w:r>
+        <w:t>Kam se greste v soseski poleti ohlajat?</w:t>
+      </w:r>
+    </w:p>
+    <w:p>
+      <w:pPr>
+        <w:keepNext/>
+      </w:pPr>
+      <w:r>
+        <w:t>☐  Park / senca pod drevesi     ☐  Dom skupnosti     ☐  Ob Savi</w:t>
+      </w:r>
+    </w:p>
+    <w:p>
+      <w:pPr>
+        <w:keepNext/>
+      </w:pPr>
+      <w:r>
+        <w:t>☐  Nikamor / ne zadeva me     ☐  Drugo: _______________________________</w:t>
+      </w:r>
+    </w:p>
+    <w:p>
+      <w:pPr>
+        <w:pStyle w:val="Heading2"/>
+        <w:keepNext/>
+      </w:pPr>
+      <w:r>
+        <w:t>9. Upravnik in zbori</w:t>
       </w:r>
     </w:p>
     <w:p>
@@ -1876,7 +1968,80 @@
         <w:keepNext/>
       </w:pPr>
       <w:r>
-        <w:t>9. Koliko ste stari?</w:t>
+        <w:t>10. Zdravstvo</w:t>
+      </w:r>
+    </w:p>
+    <w:p>
+      <w:pPr>
+        <w:keepNext/>
+      </w:pPr>
+      <w:r>
+        <w:t>Za vse (razen mlajših od 15 let)</w:t>
+      </w:r>
+    </w:p>
+    <w:p>
+      <w:pPr>
+        <w:keepNext/>
+      </w:pPr>
+      <w:r>
+        <w:t>Vsa vprašanja so neobvezna. Sprašujemo samo o dostopu, ne o boleznih ali politiki.</w:t>
+      </w:r>
+    </w:p>
+    <w:p>
+      <w:pPr>
+        <w:keepNext/>
+      </w:pPr>
+      <w:r>
+        <w:t>Kako ste zadovoljni z dostopom do zdravstvenih storitev v bližini?</w:t>
+      </w:r>
+    </w:p>
+    <w:p>
+      <w:pPr>
+        <w:keepNext/>
+      </w:pPr>
+      <w:r>
+        <w:t>1 = zelo slabo, 5 = zelo dobro.</w:t>
+      </w:r>
+    </w:p>
+    <w:p>
+      <w:pPr>
+        <w:keepNext/>
+      </w:pPr>
+      <w:r>
+        <w:t>☐  1     ☐  2     ☐  3     ☐  4     ☐  5     ☐  Ne uporabljam</w:t>
+      </w:r>
+    </w:p>
+    <w:p>
+      <w:pPr>
+        <w:keepNext/>
+      </w:pPr>
+      <w:r>
+        <w:t>Kaj vam najbolj manjka? (lahko več)</w:t>
+      </w:r>
+    </w:p>
+    <w:p>
+      <w:pPr>
+        <w:keepNext/>
+      </w:pPr>
+      <w:r>
+        <w:t>☐  Osebni zdravnik     ☐  Pediater     ☐  Zobozdravnik</w:t>
+      </w:r>
+    </w:p>
+    <w:p>
+      <w:pPr>
+        <w:keepNext/>
+      </w:pPr>
+      <w:r>
+        <w:t>☐  Specialisti     ☐  Urgenca / dežurna služba     ☐  Nič</w:t>
+      </w:r>
+    </w:p>
+    <w:p>
+      <w:pPr>
+        <w:pStyle w:val="Heading2"/>
+        <w:keepNext/>
+      </w:pPr>
+      <w:r>
+        <w:t>11. Koliko ste stari?</w:t>
       </w:r>
     </w:p>
     <w:p>
@@ -1895,7 +2060,7 @@
           <w:b w:val="0"/>
           <w:i w:val="0"/>
         </w:rPr>
-        <w:t>Glede na starost izpolnite še kratka vprašanja za svojo starostno skupino (12. in 13. korak).</w:t>
+        <w:t>Glede na starost izpolnite še kratka vprašanja za svojo starostno skupino (14. in 15. korak).</w:t>
       </w:r>
     </w:p>
     <w:p>
@@ -1937,7 +2102,7 @@
         <w:keepNext/>
       </w:pPr>
       <w:r>
-        <w:t>10. Kje in kako živite?</w:t>
+        <w:t>12. Kje in kako živite?</w:t>
       </w:r>
     </w:p>
     <w:p>
@@ -2140,7 +2305,7 @@
         <w:keepNext/>
       </w:pPr>
       <w:r>
-        <w:t>11. Promet na vaši ulici</w:t>
+        <w:t>13. Promet na vaši ulici</w:t>
       </w:r>
     </w:p>
     <w:p>
@@ -2196,7 +2361,7 @@
         <w:pStyle w:val="Heading2"/>
       </w:pPr>
       <w:r>
-        <w:t>12.–13. Vprašanja za vašo starostno skupino</w:t>
+        <w:t>14.–15. Vprašanja za vašo starostno skupino</w:t>
       </w:r>
     </w:p>
     <w:p>
@@ -2222,7 +2387,7 @@
           <w:b/>
           <w:i w:val="0"/>
         </w:rPr>
-        <w:t>12. Stopnice, dvigala in klopi</w:t>
+        <w:t>14. Stopnice, dvigala in klopi</w:t>
       </w:r>
     </w:p>
     <w:p>
@@ -2380,7 +2545,7 @@
           <w:b/>
           <w:i w:val="0"/>
         </w:rPr>
-        <w:t>13. Vsakdan in sosedje</w:t>
+        <w:t>15. Vsakdan in sosedje</w:t>
       </w:r>
     </w:p>
     <w:p>
@@ -2497,7 +2662,7 @@
           <w:b/>
           <w:i w:val="0"/>
         </w:rPr>
-        <w:t>12. Vrtec in šola</w:t>
+        <w:t>14. Vrtec in šola</w:t>
       </w:r>
     </w:p>
     <w:p>
@@ -2618,7 +2783,7 @@
           <w:b/>
           <w:i w:val="0"/>
         </w:rPr>
-        <w:t>13. Dom skupnosti</w:t>
+        <w:t>15. Dom skupnosti</w:t>
       </w:r>
     </w:p>
     <w:p>
@@ -2788,7 +2953,7 @@
           <w:b/>
           <w:i w:val="0"/>
         </w:rPr>
-        <w:t>12.–13. Še tri hitra vprašanja zate</w:t>
+        <w:t>14.–15. Še tri hitra vprašanja zate</w:t>
       </w:r>
     </w:p>
     <w:p>

</xml_diff>

<commit_message>
Združi koraka 2 in 3: najprej prosto besedilo, kaj izboljšati, nato izbor do 5 težav
</commit_message>
<xml_diff>
--- a/savska-anketa-papir.docx
+++ b/savska-anketa-papir.docx
@@ -429,7 +429,7 @@
           <w:i/>
           <w:sz w:val="20"/>
         </w:rPr>
-        <w:t>Najprej želimo slišati vaše mnenje, zato vas prosimo, da svoje opažanje opišete s svojimi besedami. Teme, na katere se lahko nanaša, boste izbrali v naslednjem koraku.</w:t>
+        <w:t>Najprej želimo slišati vaše mnenje, zato vas prosimo, da svoje opažanje opišete s svojimi besedami. Spodaj nato izberite še do 5 težav.</w:t>
       </w:r>
     </w:p>
     <w:p>
@@ -508,7 +508,167 @@
         <w:keepNext/>
       </w:pPr>
       <w:r>
-        <w:t>3. Kaj bi bilo v Savskem naselju najbolj nujno izboljšati?</w:t>
+        <w:t>Kaj bi bilo najbolj nujno izboljšati?</w:t>
+      </w:r>
+    </w:p>
+    <w:p>
+      <w:r>
+        <w:rPr>
+          <w:b w:val="0"/>
+        </w:rPr>
+        <w:t xml:space="preserve">Izberite </w:t>
+      </w:r>
+      <w:r>
+        <w:rPr>
+          <w:b/>
+        </w:rPr>
+        <w:t>do 5 težav</w:t>
+      </w:r>
+      <w:r>
+        <w:rPr>
+          <w:b w:val="0"/>
+        </w:rPr>
+        <w:t>, ki vas najbolj motijo oziroma se vam zdijo najpomembnejše.</w:t>
+      </w:r>
+    </w:p>
+    <w:p>
+      <w:pPr>
+        <w:ind w:left="283"/>
+      </w:pPr>
+      <w:r>
+        <w:rPr>
+          <w:b w:val="0"/>
+          <w:i w:val="0"/>
+        </w:rPr>
+        <w:t>☐  Promet skozi naselje     ☐  Parkiranje</w:t>
+      </w:r>
+    </w:p>
+    <w:p>
+      <w:pPr>
+        <w:ind w:left="283"/>
+      </w:pPr>
+      <w:r>
+        <w:rPr>
+          <w:b w:val="0"/>
+          <w:i w:val="0"/>
+        </w:rPr>
+        <w:t>☐  Stanovanja brez dvigala     ☐  Več klopi</w:t>
+      </w:r>
+    </w:p>
+    <w:p>
+      <w:pPr>
+        <w:ind w:left="283"/>
+      </w:pPr>
+      <w:r>
+        <w:rPr>
+          <w:b w:val="0"/>
+          <w:i w:val="0"/>
+        </w:rPr>
+        <w:t>☐  Drevesa in zelenice     ☐  Igle in droge, občutek varnosti</w:t>
+      </w:r>
+    </w:p>
+    <w:p>
+      <w:pPr>
+        <w:ind w:left="283"/>
+      </w:pPr>
+      <w:r>
+        <w:rPr>
+          <w:b w:val="0"/>
+          <w:i w:val="0"/>
+        </w:rPr>
+        <w:t>☐  Čistoča in pasji iztrebki     ☐  Hrup</w:t>
+      </w:r>
+    </w:p>
+    <w:p>
+      <w:pPr>
+        <w:ind w:left="283"/>
+      </w:pPr>
+      <w:r>
+        <w:rPr>
+          <w:b w:val="0"/>
+          <w:i w:val="0"/>
+        </w:rPr>
+        <w:t>☐  Dom skupnosti, prostor za druženje     ☐  Igrišča in prostor za mlade</w:t>
+      </w:r>
+    </w:p>
+    <w:p>
+      <w:pPr>
+        <w:ind w:left="283"/>
+      </w:pPr>
+      <w:r>
+        <w:rPr>
+          <w:b w:val="0"/>
+          <w:i w:val="0"/>
+        </w:rPr>
+        <w:t>☐  Več druženja za starejše     ☐  Skupen koledar dogodkov in aktivnosti</w:t>
+      </w:r>
+    </w:p>
+    <w:p>
+      <w:pPr>
+        <w:ind w:left="283"/>
+      </w:pPr>
+      <w:r>
+        <w:rPr>
+          <w:b w:val="0"/>
+          <w:i w:val="0"/>
+        </w:rPr>
+        <w:t>☐  Slab zrak / onesnaženost zraka     ☐  Drugo</w:t>
+      </w:r>
+    </w:p>
+    <w:p>
+      <w:pPr>
+        <w:spacing w:before="120"/>
+      </w:pPr>
+      <w:r>
+        <w:rPr>
+          <w:b w:val="0"/>
+          <w:i/>
+        </w:rPr>
+        <w:t>► Če ste izbrali »Drugo«:</w:t>
+      </w:r>
+    </w:p>
+    <w:p>
+      <w:pPr>
+        <w:keepNext/>
+        <w:spacing w:before="80"/>
+      </w:pPr>
+      <w:r>
+        <w:rPr>
+          <w:b/>
+          <w:i w:val="0"/>
+        </w:rPr>
+        <w:t>Kaj drugega?</w:t>
+      </w:r>
+    </w:p>
+    <w:p>
+      <w:pPr>
+        <w:spacing w:after="160"/>
+      </w:pPr>
+      <w:r>
+        <w:rPr>
+          <w:b w:val="0"/>
+          <w:i w:val="0"/>
+        </w:rPr>
+        <w:t>______________________________________________________________________________________</w:t>
+      </w:r>
+    </w:p>
+    <w:p>
+      <w:r>
+        <w:rPr>
+          <w:b w:val="0"/>
+          <w:i/>
+          <w:sz w:val="18"/>
+        </w:rPr>
+        <w:t>Prosimo, ne navajajte imen drugih oseb.</w:t>
+      </w:r>
+    </w:p>
+    <w:p>
+      <w:pPr>
+        <w:pStyle w:val="Heading2"/>
+        <w:keepNext/>
+      </w:pPr>
+      <w:r>
+        <w:t>3. Kako pogosto vas to prizadene?</w:t>
       </w:r>
     </w:p>
     <w:p>
@@ -525,32 +685,21 @@
       <w:r>
         <w:rPr>
           <w:b w:val="0"/>
+          <w:i w:val="0"/>
         </w:rPr>
-        <w:t xml:space="preserve">Izberite </w:t>
-      </w:r>
-      <w:r>
-        <w:rPr>
-          <w:b/>
-        </w:rPr>
-        <w:t>do 5 težav</w:t>
-      </w:r>
-      <w:r>
-        <w:rPr>
-          <w:b w:val="0"/>
-        </w:rPr>
-        <w:t>, ki vas najbolj motijo oziroma se vam zdijo najpomembnejše.</w:t>
-      </w:r>
-    </w:p>
-    <w:p>
-      <w:pPr>
-        <w:ind w:left="283"/>
+        <w:t>Samo za stvari, ki ste jih izbrali v 2. koraku. Vpišite težavo in obkljukajte pogostost.</w:t>
+      </w:r>
+    </w:p>
+    <w:p>
+      <w:pPr>
+        <w:spacing w:before="120"/>
       </w:pPr>
       <w:r>
         <w:rPr>
           <w:b w:val="0"/>
           <w:i w:val="0"/>
         </w:rPr>
-        <w:t>☐  Promet skozi naselje     ☐  Parkiranje</w:t>
+        <w:t>Težava 1: ____________________________________________________________</w:t>
       </w:r>
     </w:p>
     <w:p>
@@ -562,19 +711,19 @@
           <w:b w:val="0"/>
           <w:i w:val="0"/>
         </w:rPr>
-        <w:t>☐  Stanovanja brez dvigala     ☐  Več klopi</w:t>
-      </w:r>
-    </w:p>
-    <w:p>
-      <w:pPr>
-        <w:ind w:left="283"/>
+        <w:t>☐  Skoraj vsak dan     ☐  Vsak teden     ☐  Nekajkrat na mesec     ☐  Redko</w:t>
+      </w:r>
+    </w:p>
+    <w:p>
+      <w:pPr>
+        <w:spacing w:before="120"/>
       </w:pPr>
       <w:r>
         <w:rPr>
           <w:b w:val="0"/>
           <w:i w:val="0"/>
         </w:rPr>
-        <w:t>☐  Drevesa in zelenice     ☐  Igle in droge, občutek varnosti</w:t>
+        <w:t>Težava 2: ____________________________________________________________</w:t>
       </w:r>
     </w:p>
     <w:p>
@@ -586,19 +735,19 @@
           <w:b w:val="0"/>
           <w:i w:val="0"/>
         </w:rPr>
-        <w:t>☐  Čistoča in pasji iztrebki     ☐  Hrup</w:t>
-      </w:r>
-    </w:p>
-    <w:p>
-      <w:pPr>
-        <w:ind w:left="283"/>
+        <w:t>☐  Skoraj vsak dan     ☐  Vsak teden     ☐  Nekajkrat na mesec     ☐  Redko</w:t>
+      </w:r>
+    </w:p>
+    <w:p>
+      <w:pPr>
+        <w:spacing w:before="120"/>
       </w:pPr>
       <w:r>
         <w:rPr>
           <w:b w:val="0"/>
           <w:i w:val="0"/>
         </w:rPr>
-        <w:t>☐  Dom skupnosti, prostor za druženje     ☐  Igrišča in prostor za mlade</w:t>
+        <w:t>Težava 3: ____________________________________________________________</w:t>
       </w:r>
     </w:p>
     <w:p>
@@ -610,56 +759,282 @@
           <w:b w:val="0"/>
           <w:i w:val="0"/>
         </w:rPr>
-        <w:t>☐  Več druženja za starejše     ☐  Skupen koledar dogodkov in aktivnosti</w:t>
-      </w:r>
-    </w:p>
-    <w:p>
-      <w:pPr>
-        <w:ind w:left="283"/>
+        <w:t>☐  Skoraj vsak dan     ☐  Vsak teden     ☐  Nekajkrat na mesec     ☐  Redko</w:t>
+      </w:r>
+    </w:p>
+    <w:p>
+      <w:pPr>
+        <w:spacing w:before="120"/>
       </w:pPr>
       <w:r>
         <w:rPr>
           <w:b w:val="0"/>
           <w:i w:val="0"/>
         </w:rPr>
-        <w:t>☐  Slab zrak / onesnaženost zraka     ☐  Drugo</w:t>
+        <w:t>Težava 4: ____________________________________________________________</w:t>
+      </w:r>
+    </w:p>
+    <w:p>
+      <w:pPr>
+        <w:ind w:left="283"/>
+      </w:pPr>
+      <w:r>
+        <w:rPr>
+          <w:b w:val="0"/>
+          <w:i w:val="0"/>
+        </w:rPr>
+        <w:t>☐  Skoraj vsak dan     ☐  Vsak teden     ☐  Nekajkrat na mesec     ☐  Redko</w:t>
       </w:r>
     </w:p>
     <w:p>
       <w:pPr>
         <w:spacing w:before="120"/>
       </w:pPr>
+      <w:r>
+        <w:rPr>
+          <w:b w:val="0"/>
+          <w:i w:val="0"/>
+        </w:rPr>
+        <w:t>Težava 5: ____________________________________________________________</w:t>
+      </w:r>
+    </w:p>
+    <w:p>
+      <w:pPr>
+        <w:ind w:left="283"/>
+      </w:pPr>
+      <w:r>
+        <w:rPr>
+          <w:b w:val="0"/>
+          <w:i w:val="0"/>
+        </w:rPr>
+        <w:t>☐  Skoraj vsak dan     ☐  Vsak teden     ☐  Nekajkrat na mesec     ☐  Redko</w:t>
+      </w:r>
+    </w:p>
+    <w:p>
+      <w:pPr>
+        <w:pStyle w:val="Heading2"/>
+        <w:keepNext/>
+      </w:pPr>
+      <w:r>
+        <w:t>4. Kje so te težave?</w:t>
+      </w:r>
+    </w:p>
+    <w:p>
       <w:r>
         <w:rPr>
           <w:b w:val="0"/>
           <w:i/>
+          <w:sz w:val="18"/>
         </w:rPr>
-        <w:t>► Če ste izbrali »Drugo«:</w:t>
-      </w:r>
-    </w:p>
-    <w:p>
-      <w:pPr>
-        <w:keepNext/>
-        <w:spacing w:before="80"/>
+        <w:t>Za vse</w:t>
+      </w:r>
+    </w:p>
+    <w:p>
+      <w:r>
+        <w:rPr>
+          <w:b w:val="0"/>
+          <w:i w:val="0"/>
+        </w:rPr>
+        <w:t>Za težave, ki ste jih izbrali v 2. koraku, označite kraj. Tema je že izbrana – tu samo kje. Lahko tudi preskočite.</w:t>
+      </w:r>
+    </w:p>
+    <w:p>
+      <w:pPr>
+        <w:spacing w:before="120"/>
       </w:pPr>
       <w:r>
         <w:rPr>
           <w:b/>
           <w:i w:val="0"/>
         </w:rPr>
-        <w:t>Kaj drugega?</w:t>
-      </w:r>
-    </w:p>
-    <w:p>
-      <w:pPr>
-        <w:spacing w:after="160"/>
-      </w:pPr>
+        <w:t>Težava 1 (napišite, katero ste izbrali v 2. koraku): ______________________</w:t>
+      </w:r>
+    </w:p>
+    <w:p>
       <w:r>
         <w:rPr>
           <w:b w:val="0"/>
           <w:i w:val="0"/>
         </w:rPr>
-        <w:t>______________________________________________________________________________________</w:t>
+        <w:t>Kje (ulica / kraj / št. na zemljevidu): _________________________________</w:t>
+      </w:r>
+    </w:p>
+    <w:p>
+      <w:r>
+        <w:rPr>
+          <w:b w:val="0"/>
+          <w:i w:val="0"/>
+        </w:rPr>
+        <w:t>Natančneje (neobvezno): ____________________________________________________</w:t>
+      </w:r>
+    </w:p>
+    <w:p>
+      <w:r>
+        <w:rPr>
+          <w:b w:val="0"/>
+          <w:i w:val="0"/>
+        </w:rPr>
+      </w:r>
+    </w:p>
+    <w:p>
+      <w:pPr>
+        <w:spacing w:before="120"/>
+      </w:pPr>
+      <w:r>
+        <w:rPr>
+          <w:b/>
+          <w:i w:val="0"/>
+        </w:rPr>
+        <w:t>Težava 2 (napišite, katero ste izbrali v 2. koraku): ______________________</w:t>
+      </w:r>
+    </w:p>
+    <w:p>
+      <w:r>
+        <w:rPr>
+          <w:b w:val="0"/>
+          <w:i w:val="0"/>
+        </w:rPr>
+        <w:t>Kje (ulica / kraj / št. na zemljevidu): _________________________________</w:t>
+      </w:r>
+    </w:p>
+    <w:p>
+      <w:r>
+        <w:rPr>
+          <w:b w:val="0"/>
+          <w:i w:val="0"/>
+        </w:rPr>
+        <w:t>Natančneje (neobvezno): ____________________________________________________</w:t>
+      </w:r>
+    </w:p>
+    <w:p>
+      <w:r>
+        <w:rPr>
+          <w:b w:val="0"/>
+          <w:i w:val="0"/>
+        </w:rPr>
+      </w:r>
+    </w:p>
+    <w:p>
+      <w:pPr>
+        <w:spacing w:before="120"/>
+      </w:pPr>
+      <w:r>
+        <w:rPr>
+          <w:b/>
+          <w:i w:val="0"/>
+        </w:rPr>
+        <w:t>Težava 3 (napišite, katero ste izbrali v 2. koraku): ______________________</w:t>
+      </w:r>
+    </w:p>
+    <w:p>
+      <w:r>
+        <w:rPr>
+          <w:b w:val="0"/>
+          <w:i w:val="0"/>
+        </w:rPr>
+        <w:t>Kje (ulica / kraj / št. na zemljevidu): _________________________________</w:t>
+      </w:r>
+    </w:p>
+    <w:p>
+      <w:r>
+        <w:rPr>
+          <w:b w:val="0"/>
+          <w:i w:val="0"/>
+        </w:rPr>
+        <w:t>Natančneje (neobvezno): ____________________________________________________</w:t>
+      </w:r>
+    </w:p>
+    <w:p>
+      <w:r>
+        <w:rPr>
+          <w:b w:val="0"/>
+          <w:i w:val="0"/>
+        </w:rPr>
+      </w:r>
+    </w:p>
+    <w:p>
+      <w:pPr>
+        <w:spacing w:before="120"/>
+      </w:pPr>
+      <w:r>
+        <w:rPr>
+          <w:b/>
+          <w:i w:val="0"/>
+        </w:rPr>
+        <w:t>Težava 4 (napišite, katero ste izbrali v 2. koraku): ______________________</w:t>
+      </w:r>
+    </w:p>
+    <w:p>
+      <w:r>
+        <w:rPr>
+          <w:b w:val="0"/>
+          <w:i w:val="0"/>
+        </w:rPr>
+        <w:t>Kje (ulica / kraj / št. na zemljevidu): _________________________________</w:t>
+      </w:r>
+    </w:p>
+    <w:p>
+      <w:r>
+        <w:rPr>
+          <w:b w:val="0"/>
+          <w:i w:val="0"/>
+        </w:rPr>
+        <w:t>Natančneje (neobvezno): ____________________________________________________</w:t>
+      </w:r>
+    </w:p>
+    <w:p>
+      <w:r>
+        <w:rPr>
+          <w:b w:val="0"/>
+          <w:i w:val="0"/>
+        </w:rPr>
+      </w:r>
+    </w:p>
+    <w:p>
+      <w:pPr>
+        <w:spacing w:before="120"/>
+      </w:pPr>
+      <w:r>
+        <w:rPr>
+          <w:b/>
+          <w:i w:val="0"/>
+        </w:rPr>
+        <w:t>Težava 5 (napišite, katero ste izbrali v 2. koraku): ______________________</w:t>
+      </w:r>
+    </w:p>
+    <w:p>
+      <w:r>
+        <w:rPr>
+          <w:b w:val="0"/>
+          <w:i w:val="0"/>
+        </w:rPr>
+        <w:t>Kje (ulica / kraj / št. na zemljevidu): _________________________________</w:t>
+      </w:r>
+    </w:p>
+    <w:p>
+      <w:r>
+        <w:rPr>
+          <w:b w:val="0"/>
+          <w:i w:val="0"/>
+        </w:rPr>
+        <w:t>Natančneje (neobvezno): ____________________________________________________</w:t>
+      </w:r>
+    </w:p>
+    <w:p>
+      <w:r>
+        <w:rPr>
+          <w:b w:val="0"/>
+          <w:i w:val="0"/>
+        </w:rPr>
+      </w:r>
+    </w:p>
+    <w:p>
+      <w:r>
+        <w:rPr>
+          <w:b w:val="0"/>
+          <w:i w:val="0"/>
+        </w:rPr>
+        <w:t>☐  Ne vem / velja za celo naselje</w:t>
       </w:r>
     </w:p>
     <w:p>
@@ -678,7 +1053,7 @@
         <w:keepNext/>
       </w:pPr>
       <w:r>
-        <w:t>4. Kako pogosto vas to prizadene?</w:t>
+        <w:t>5. Čistilni četrtek</w:t>
       </w:r>
     </w:p>
     <w:p>
@@ -692,132 +1067,41 @@
       </w:r>
     </w:p>
     <w:p>
+      <w:pPr>
+        <w:keepNext/>
+        <w:spacing w:before="160"/>
+      </w:pPr>
+      <w:r>
+        <w:rPr>
+          <w:b/>
+          <w:i w:val="0"/>
+        </w:rPr>
+        <w:t>Ali podpirate Čistilni četrtek, ko bi vsi prebivalci skupaj in prostovoljno enkrat na teden očistili Savsko naselje?</w:t>
+      </w:r>
+    </w:p>
+    <w:p>
+      <w:pPr>
+        <w:keepNext/>
+      </w:pPr>
+      <w:r>
+        <w:rPr>
+          <w:b w:val="0"/>
+          <w:i/>
+          <w:sz w:val="20"/>
+        </w:rPr>
+        <w:t>Neobvezno.</w:t>
+      </w:r>
+    </w:p>
+    <w:p>
+      <w:pPr>
+        <w:ind w:left="283"/>
+      </w:pPr>
       <w:r>
         <w:rPr>
           <w:b w:val="0"/>
           <w:i w:val="0"/>
         </w:rPr>
-        <w:t>Samo za stvari, ki ste jih izbrali v 3. koraku. Vpišite težavo in obkljukajte pogostost.</w:t>
-      </w:r>
-    </w:p>
-    <w:p>
-      <w:pPr>
-        <w:spacing w:before="120"/>
-      </w:pPr>
-      <w:r>
-        <w:rPr>
-          <w:b w:val="0"/>
-          <w:i w:val="0"/>
-        </w:rPr>
-        <w:t>Težava 1: ____________________________________________________________</w:t>
-      </w:r>
-    </w:p>
-    <w:p>
-      <w:pPr>
-        <w:ind w:left="283"/>
-      </w:pPr>
-      <w:r>
-        <w:rPr>
-          <w:b w:val="0"/>
-          <w:i w:val="0"/>
-        </w:rPr>
-        <w:t>☐  Skoraj vsak dan     ☐  Vsak teden     ☐  Nekajkrat na mesec     ☐  Redko</w:t>
-      </w:r>
-    </w:p>
-    <w:p>
-      <w:pPr>
-        <w:spacing w:before="120"/>
-      </w:pPr>
-      <w:r>
-        <w:rPr>
-          <w:b w:val="0"/>
-          <w:i w:val="0"/>
-        </w:rPr>
-        <w:t>Težava 2: ____________________________________________________________</w:t>
-      </w:r>
-    </w:p>
-    <w:p>
-      <w:pPr>
-        <w:ind w:left="283"/>
-      </w:pPr>
-      <w:r>
-        <w:rPr>
-          <w:b w:val="0"/>
-          <w:i w:val="0"/>
-        </w:rPr>
-        <w:t>☐  Skoraj vsak dan     ☐  Vsak teden     ☐  Nekajkrat na mesec     ☐  Redko</w:t>
-      </w:r>
-    </w:p>
-    <w:p>
-      <w:pPr>
-        <w:spacing w:before="120"/>
-      </w:pPr>
-      <w:r>
-        <w:rPr>
-          <w:b w:val="0"/>
-          <w:i w:val="0"/>
-        </w:rPr>
-        <w:t>Težava 3: ____________________________________________________________</w:t>
-      </w:r>
-    </w:p>
-    <w:p>
-      <w:pPr>
-        <w:ind w:left="283"/>
-      </w:pPr>
-      <w:r>
-        <w:rPr>
-          <w:b w:val="0"/>
-          <w:i w:val="0"/>
-        </w:rPr>
-        <w:t>☐  Skoraj vsak dan     ☐  Vsak teden     ☐  Nekajkrat na mesec     ☐  Redko</w:t>
-      </w:r>
-    </w:p>
-    <w:p>
-      <w:pPr>
-        <w:spacing w:before="120"/>
-      </w:pPr>
-      <w:r>
-        <w:rPr>
-          <w:b w:val="0"/>
-          <w:i w:val="0"/>
-        </w:rPr>
-        <w:t>Težava 4: ____________________________________________________________</w:t>
-      </w:r>
-    </w:p>
-    <w:p>
-      <w:pPr>
-        <w:ind w:left="283"/>
-      </w:pPr>
-      <w:r>
-        <w:rPr>
-          <w:b w:val="0"/>
-          <w:i w:val="0"/>
-        </w:rPr>
-        <w:t>☐  Skoraj vsak dan     ☐  Vsak teden     ☐  Nekajkrat na mesec     ☐  Redko</w:t>
-      </w:r>
-    </w:p>
-    <w:p>
-      <w:pPr>
-        <w:spacing w:before="120"/>
-      </w:pPr>
-      <w:r>
-        <w:rPr>
-          <w:b w:val="0"/>
-          <w:i w:val="0"/>
-        </w:rPr>
-        <w:t>Težava 5: ____________________________________________________________</w:t>
-      </w:r>
-    </w:p>
-    <w:p>
-      <w:pPr>
-        <w:ind w:left="283"/>
-      </w:pPr>
-      <w:r>
-        <w:rPr>
-          <w:b w:val="0"/>
-          <w:i w:val="0"/>
-        </w:rPr>
-        <w:t>☐  Skoraj vsak dan     ☐  Vsak teden     ☐  Nekajkrat na mesec     ☐  Redko</w:t>
+        <w:t>☐  Da, podpiram     ☐  Morda     ☐  Ne</w:t>
       </w:r>
     </w:p>
     <w:p>
@@ -826,7 +1110,7 @@
         <w:keepNext/>
       </w:pPr>
       <w:r>
-        <w:t>5. Kje so te težave?</w:t>
+        <w:t>6. Vozila, parkiranje in promet</w:t>
       </w:r>
     </w:p>
     <w:p>
@@ -845,104 +1129,406 @@
           <w:b w:val="0"/>
           <w:i w:val="0"/>
         </w:rPr>
-        <w:t>Za težave, ki ste jih izbrali v 3. koraku, označite kraj. Tema je že izbrana – tu samo kje. Lahko tudi preskočite.</w:t>
-      </w:r>
-    </w:p>
-    <w:p>
-      <w:pPr>
-        <w:spacing w:before="120"/>
+        <w:t>Vsa vprašanja so neobvezna.</w:t>
+      </w:r>
+    </w:p>
+    <w:p>
+      <w:pPr>
+        <w:keepNext/>
+        <w:spacing w:before="160"/>
       </w:pPr>
       <w:r>
         <w:rPr>
           <w:b/>
           <w:i w:val="0"/>
         </w:rPr>
-        <w:t>Težava 1 (napišite, katero ste izbrali v 3. koraku): ______________________</w:t>
-      </w:r>
-    </w:p>
-    <w:p>
+        <w:t>Koliko vozil (avtomobilov) je v vašem gospodinjstvu?</w:t>
+      </w:r>
+    </w:p>
+    <w:p>
+      <w:pPr>
+        <w:keepNext/>
+      </w:pPr>
+      <w:r>
+        <w:rPr>
+          <w:b w:val="0"/>
+          <w:i/>
+          <w:sz w:val="20"/>
+        </w:rPr>
+        <w:t>Če izberete 0, vprašanja o parkiranju preskočite.</w:t>
+      </w:r>
+    </w:p>
+    <w:p>
+      <w:pPr>
+        <w:ind w:left="283"/>
+      </w:pPr>
       <w:r>
         <w:rPr>
           <w:b w:val="0"/>
           <w:i w:val="0"/>
         </w:rPr>
-        <w:t>Kje (ulica / kraj / št. na zemljevidu): _________________________________</w:t>
-      </w:r>
-    </w:p>
-    <w:p>
+        <w:t>☐  0     ☐  1     ☐  2     ☐  3 ali več</w:t>
+      </w:r>
+    </w:p>
+    <w:p>
+      <w:pPr>
+        <w:spacing w:before="120"/>
+      </w:pPr>
+      <w:r>
+        <w:rPr>
+          <w:b w:val="0"/>
+          <w:i/>
+        </w:rPr>
+        <w:t>► Če imate vsaj 1 vozilo:</w:t>
+      </w:r>
+    </w:p>
+    <w:p>
+      <w:pPr>
+        <w:keepNext/>
+        <w:spacing w:before="80"/>
+      </w:pPr>
+      <w:r>
+        <w:rPr>
+          <w:b/>
+          <w:i w:val="0"/>
+        </w:rPr>
+        <w:t>Kje najpogosteje parkirate ponoči?</w:t>
+      </w:r>
+    </w:p>
+    <w:p>
+      <w:pPr>
+        <w:ind w:left="283"/>
+      </w:pPr>
       <w:r>
         <w:rPr>
           <w:b w:val="0"/>
           <w:i w:val="0"/>
         </w:rPr>
-        <w:t>Natančneje (neobvezno): ____________________________________________________</w:t>
-      </w:r>
-    </w:p>
-    <w:p>
+        <w:t>☐  na urejenem parkirišču ob bloku</w:t>
+      </w:r>
+    </w:p>
+    <w:p>
+      <w:pPr>
+        <w:ind w:left="283"/>
+      </w:pPr>
       <w:r>
         <w:rPr>
           <w:b w:val="0"/>
           <w:i w:val="0"/>
         </w:rPr>
+        <w:t>☐  na ulici</w:t>
+      </w:r>
+    </w:p>
+    <w:p>
+      <w:pPr>
+        <w:ind w:left="283"/>
+      </w:pPr>
+      <w:r>
+        <w:rPr>
+          <w:b w:val="0"/>
+          <w:i w:val="0"/>
+        </w:rPr>
+        <w:t>☐  v garaži ali na najetem mestu</w:t>
+      </w:r>
+    </w:p>
+    <w:p>
+      <w:pPr>
+        <w:ind w:left="283"/>
+      </w:pPr>
+      <w:r>
+        <w:rPr>
+          <w:b w:val="0"/>
+          <w:i w:val="0"/>
+        </w:rPr>
+        <w:t>☐  kjer najdem prostor, tudi na zelenici ali pločniku</w:t>
       </w:r>
     </w:p>
     <w:p>
       <w:pPr>
         <w:spacing w:before="120"/>
+      </w:pPr>
+      <w:r>
+        <w:rPr>
+          <w:b w:val="0"/>
+          <w:i/>
+        </w:rPr>
+        <w:t>► Če imate vsaj 1 vozilo:</w:t>
+      </w:r>
+    </w:p>
+    <w:p>
+      <w:pPr>
+        <w:keepNext/>
+        <w:spacing w:before="80"/>
       </w:pPr>
       <w:r>
         <w:rPr>
           <w:b/>
           <w:i w:val="0"/>
         </w:rPr>
-        <w:t>Težava 2 (napišite, katero ste izbrali v 3. koraku): ______________________</w:t>
-      </w:r>
-    </w:p>
-    <w:p>
+        <w:t>Kako pogosto imate težave s parkiranjem?</w:t>
+      </w:r>
+    </w:p>
+    <w:p>
+      <w:pPr>
+        <w:ind w:left="283"/>
+      </w:pPr>
       <w:r>
         <w:rPr>
           <w:b w:val="0"/>
           <w:i w:val="0"/>
         </w:rPr>
-        <w:t>Kje (ulica / kraj / št. na zemljevidu): _________________________________</w:t>
-      </w:r>
-    </w:p>
-    <w:p>
+        <w:t>☐  Pogosto     ☐  Včasih     ☐  Ne</w:t>
+      </w:r>
+    </w:p>
+    <w:p>
+      <w:pPr>
+        <w:spacing w:before="120"/>
+      </w:pPr>
+      <w:r>
+        <w:rPr>
+          <w:b w:val="0"/>
+          <w:i/>
+        </w:rPr>
+        <w:t>► Če imate vsaj 1 vozilo:</w:t>
+      </w:r>
+    </w:p>
+    <w:p>
+      <w:pPr>
+        <w:keepNext/>
+        <w:spacing w:before="80"/>
+      </w:pPr>
+      <w:r>
+        <w:rPr>
+          <w:b/>
+          <w:i w:val="0"/>
+        </w:rPr>
+        <w:t>Bi želeli garažo ali garažno mesto?</w:t>
+      </w:r>
+    </w:p>
+    <w:p>
+      <w:pPr>
+        <w:ind w:left="283"/>
+      </w:pPr>
       <w:r>
         <w:rPr>
           <w:b w:val="0"/>
           <w:i w:val="0"/>
         </w:rPr>
-        <w:t>Natančneje (neobvezno): ____________________________________________________</w:t>
-      </w:r>
-    </w:p>
-    <w:p>
+        <w:t>☐  Da     ☐  Morda     ☐  Ne</w:t>
+      </w:r>
+    </w:p>
+    <w:p>
+      <w:pPr>
+        <w:spacing w:before="120"/>
+      </w:pPr>
+      <w:r>
+        <w:rPr>
+          <w:b w:val="0"/>
+          <w:i/>
+        </w:rPr>
+        <w:t>► Če ste pri garaži odgovorili »Da« ali »Morda«:</w:t>
+      </w:r>
+    </w:p>
+    <w:p>
+      <w:pPr>
+        <w:keepNext/>
+        <w:spacing w:before="80"/>
+      </w:pPr>
+      <w:r>
+        <w:rPr>
+          <w:b/>
+          <w:i w:val="0"/>
+        </w:rPr>
+        <w:t>Koliko bi bili zanjo pripravljeni plačati (nakup)?</w:t>
+      </w:r>
+    </w:p>
+    <w:p>
+      <w:pPr>
+        <w:ind w:left="283"/>
+      </w:pPr>
       <w:r>
         <w:rPr>
           <w:b w:val="0"/>
           <w:i w:val="0"/>
         </w:rPr>
-      </w:r>
-    </w:p>
-    <w:p>
-      <w:pPr>
-        <w:spacing w:before="120"/>
+        <w:t>☐  Le brezplačno     ☐  do 5.000 €</w:t>
+      </w:r>
+    </w:p>
+    <w:p>
+      <w:pPr>
+        <w:ind w:left="283"/>
+      </w:pPr>
+      <w:r>
+        <w:rPr>
+          <w:b w:val="0"/>
+          <w:i w:val="0"/>
+        </w:rPr>
+        <w:t>☐  5.000–10.000 €     ☐  10.000–20.000 €</w:t>
+      </w:r>
+    </w:p>
+    <w:p>
+      <w:pPr>
+        <w:ind w:left="283"/>
+      </w:pPr>
+      <w:r>
+        <w:rPr>
+          <w:b w:val="0"/>
+          <w:i w:val="0"/>
+        </w:rPr>
+        <w:t>☐  20.000–30.000 €     ☐  30.000–40.000 €</w:t>
+      </w:r>
+    </w:p>
+    <w:p>
+      <w:pPr>
+        <w:ind w:left="283"/>
+      </w:pPr>
+      <w:r>
+        <w:rPr>
+          <w:b w:val="0"/>
+          <w:i w:val="0"/>
+        </w:rPr>
+        <w:t>☐  več kot 40.000 €     ☐  Ne želim odgovoriti</w:t>
+      </w:r>
+    </w:p>
+    <w:p>
+      <w:pPr>
+        <w:keepNext/>
+        <w:spacing w:before="160"/>
       </w:pPr>
       <w:r>
         <w:rPr>
           <w:b/>
           <w:i w:val="0"/>
         </w:rPr>
-        <w:t>Težava 3 (napišite, katero ste izbrali v 3. koraku): ______________________</w:t>
-      </w:r>
-    </w:p>
-    <w:p>
+        <w:t>Kako ste zadovoljni z novo prometno ureditvijo v naselju?</w:t>
+      </w:r>
+    </w:p>
+    <w:p>
+      <w:pPr>
+        <w:ind w:left="283"/>
+      </w:pPr>
       <w:r>
         <w:rPr>
           <w:b w:val="0"/>
           <w:i w:val="0"/>
         </w:rPr>
-        <w:t>Kje (ulica / kraj / št. na zemljevidu): _________________________________</w:t>
+        <w:t>☐  Super je     ☐  Je v redu     ☐  Slabo     ☐  Katastrofa     ☐  Ne vem</w:t>
+      </w:r>
+    </w:p>
+    <w:p>
+      <w:pPr>
+        <w:keepNext/>
+      </w:pPr>
+      <w:r>
+        <w:t>Katero prevozno sredstvo najpogosteje uporabljate za vsakodnevne poti?</w:t>
+      </w:r>
+    </w:p>
+    <w:p>
+      <w:pPr>
+        <w:keepNext/>
+      </w:pPr>
+      <w:r>
+        <w:t>Neobvezno.</w:t>
+      </w:r>
+    </w:p>
+    <w:p>
+      <w:pPr>
+        <w:keepNext/>
+      </w:pPr>
+      <w:r>
+        <w:t>☐  Peš     ☐  Kolo     ☐  JPP (avtobus)     ☐  Avto     ☐  Drugo</w:t>
+      </w:r>
+    </w:p>
+    <w:p>
+      <w:pPr>
+        <w:pStyle w:val="Heading2"/>
+        <w:keepNext/>
+      </w:pPr>
+      <w:r>
+        <w:t>7. Storitve v bližini in ohladitev</w:t>
+      </w:r>
+    </w:p>
+    <w:p>
+      <w:pPr>
+        <w:keepNext/>
+      </w:pPr>
+      <w:r>
+        <w:t>Za vse</w:t>
+      </w:r>
+    </w:p>
+    <w:p>
+      <w:pPr>
+        <w:keepNext/>
+      </w:pPr>
+      <w:r>
+        <w:t>Vsa vprašanja so neobvezna.</w:t>
+      </w:r>
+    </w:p>
+    <w:p>
+      <w:pPr>
+        <w:keepNext/>
+      </w:pPr>
+      <w:r>
+        <w:t>Katere storitve v bližini pogrešate? (lahko več)</w:t>
+      </w:r>
+    </w:p>
+    <w:p>
+      <w:pPr>
+        <w:keepNext/>
+      </w:pPr>
+      <w:r>
+        <w:t>☐  Banka     ☐  Pošta     ☐  Trgovina     ☐  Lekarna     ☐  Drugo</w:t>
+      </w:r>
+    </w:p>
+    <w:p>
+      <w:pPr>
+        <w:keepNext/>
+      </w:pPr>
+      <w:r>
+        <w:t>Če drugo – na kratko: ________________________________________________</w:t>
+      </w:r>
+    </w:p>
+    <w:p>
+      <w:pPr>
+        <w:keepNext/>
+      </w:pPr>
+      <w:r>
+        <w:t>Kam se greste v soseski poleti ohlajat?</w:t>
+      </w:r>
+    </w:p>
+    <w:p>
+      <w:pPr>
+        <w:keepNext/>
+      </w:pPr>
+      <w:r>
+        <w:t>☐  Park / senca pod drevesi     ☐  Dom skupnosti     ☐  Ob Savi</w:t>
+      </w:r>
+    </w:p>
+    <w:p>
+      <w:pPr>
+        <w:keepNext/>
+      </w:pPr>
+      <w:r>
+        <w:t>☐  Nikamor / ne zadeva me     ☐  Drugo: _______________________________</w:t>
+      </w:r>
+    </w:p>
+    <w:p>
+      <w:pPr>
+        <w:pStyle w:val="Heading2"/>
+        <w:keepNext/>
+      </w:pPr>
+      <w:r>
+        <w:t>8. Upravnik in zbori</w:t>
+      </w:r>
+    </w:p>
+    <w:p>
+      <w:r>
+        <w:rPr>
+          <w:b w:val="0"/>
+          <w:i/>
+          <w:sz w:val="18"/>
+        </w:rPr>
+        <w:t>Za vse</w:t>
       </w:r>
     </w:p>
     <w:p>
@@ -951,100 +1537,983 @@
           <w:b w:val="0"/>
           <w:i w:val="0"/>
         </w:rPr>
-        <w:t>Natančneje (neobvezno): ____________________________________________________</w:t>
-      </w:r>
-    </w:p>
-    <w:p>
+        <w:t>Vsa vprašanja so neobvezna. Ne sprašujemo po imenu upravnika.</w:t>
+      </w:r>
+    </w:p>
+    <w:p>
+      <w:pPr>
+        <w:keepNext/>
+        <w:spacing w:before="160"/>
+      </w:pPr>
+      <w:r>
+        <w:rPr>
+          <w:b/>
+          <w:i w:val="0"/>
+        </w:rPr>
+        <w:t>Ali veste, kdo je upravnik vašega bloka?</w:t>
+      </w:r>
+    </w:p>
+    <w:p>
+      <w:pPr>
+        <w:ind w:left="283"/>
+      </w:pPr>
       <w:r>
         <w:rPr>
           <w:b w:val="0"/>
           <w:i w:val="0"/>
         </w:rPr>
+        <w:t>☐  Da     ☐  Ne</w:t>
       </w:r>
     </w:p>
     <w:p>
       <w:pPr>
         <w:spacing w:before="120"/>
+      </w:pPr>
+      <w:r>
+        <w:rPr>
+          <w:b w:val="0"/>
+          <w:i/>
+        </w:rPr>
+        <w:t>► Če ste odgovorili »Da«:</w:t>
+      </w:r>
+    </w:p>
+    <w:p>
+      <w:pPr>
+        <w:keepNext/>
+        <w:spacing w:before="80"/>
       </w:pPr>
       <w:r>
         <w:rPr>
           <w:b/>
           <w:i w:val="0"/>
         </w:rPr>
-        <w:t>Težava 4 (napišite, katero ste izbrali v 3. koraku): ______________________</w:t>
-      </w:r>
-    </w:p>
-    <w:p>
+        <w:t>Kako ste zadovoljni z upravnikom?</w:t>
+      </w:r>
+    </w:p>
+    <w:p>
+      <w:pPr>
+        <w:ind w:left="283"/>
+      </w:pPr>
       <w:r>
         <w:rPr>
           <w:b w:val="0"/>
           <w:i w:val="0"/>
         </w:rPr>
-        <w:t>Kje (ulica / kraj / št. na zemljevidu): _________________________________</w:t>
-      </w:r>
-    </w:p>
-    <w:p>
+        <w:t>Odzivnost:</w:t>
+      </w:r>
+    </w:p>
+    <w:p>
+      <w:pPr>
+        <w:ind w:left="567"/>
+      </w:pPr>
       <w:r>
         <w:rPr>
           <w:b w:val="0"/>
           <w:i w:val="0"/>
         </w:rPr>
-        <w:t>Natančneje (neobvezno): ____________________________________________________</w:t>
-      </w:r>
-    </w:p>
-    <w:p>
+        <w:t>☐  Zelo     ☐  Kar     ☐  Malo     ☐  Sploh ne     ☐  Ne vem</w:t>
+      </w:r>
+    </w:p>
+    <w:p>
+      <w:pPr>
+        <w:ind w:left="283"/>
+      </w:pPr>
       <w:r>
         <w:rPr>
           <w:b w:val="0"/>
           <w:i w:val="0"/>
         </w:rPr>
-      </w:r>
-    </w:p>
-    <w:p>
-      <w:pPr>
-        <w:spacing w:before="120"/>
+        <w:t>Vzdrževanje in čistoča:</w:t>
+      </w:r>
+    </w:p>
+    <w:p>
+      <w:pPr>
+        <w:ind w:left="567"/>
+      </w:pPr>
+      <w:r>
+        <w:rPr>
+          <w:b w:val="0"/>
+          <w:i w:val="0"/>
+        </w:rPr>
+        <w:t>☐  Zelo     ☐  Kar     ☐  Malo     ☐  Sploh ne     ☐  Ne vem</w:t>
+      </w:r>
+    </w:p>
+    <w:p>
+      <w:pPr>
+        <w:ind w:left="283"/>
+      </w:pPr>
+      <w:r>
+        <w:rPr>
+          <w:b w:val="0"/>
+          <w:i w:val="0"/>
+        </w:rPr>
+        <w:t>Stroški:</w:t>
+      </w:r>
+    </w:p>
+    <w:p>
+      <w:pPr>
+        <w:ind w:left="567"/>
+      </w:pPr>
+      <w:r>
+        <w:rPr>
+          <w:b w:val="0"/>
+          <w:i w:val="0"/>
+        </w:rPr>
+        <w:t>☐  Zelo     ☐  Kar     ☐  Malo     ☐  Sploh ne     ☐  Ne vem</w:t>
+      </w:r>
+    </w:p>
+    <w:p>
+      <w:pPr>
+        <w:ind w:left="283"/>
+      </w:pPr>
+      <w:r>
+        <w:rPr>
+          <w:b w:val="0"/>
+          <w:i w:val="0"/>
+        </w:rPr>
+        <w:t>Obveščanje:</w:t>
+      </w:r>
+    </w:p>
+    <w:p>
+      <w:pPr>
+        <w:ind w:left="567"/>
+      </w:pPr>
+      <w:r>
+        <w:rPr>
+          <w:b w:val="0"/>
+          <w:i w:val="0"/>
+        </w:rPr>
+        <w:t>☐  Zelo     ☐  Kar     ☐  Malo     ☐  Sploh ne     ☐  Ne vem</w:t>
+      </w:r>
+    </w:p>
+    <w:p>
+      <w:pPr>
+        <w:keepNext/>
+        <w:spacing w:before="160"/>
       </w:pPr>
       <w:r>
         <w:rPr>
           <w:b/>
           <w:i w:val="0"/>
         </w:rPr>
-        <w:t>Težava 5 (napišite, katero ste izbrali v 3. koraku): ______________________</w:t>
-      </w:r>
-    </w:p>
-    <w:p>
+        <w:t>Ali veste, kdo je vaš hišnik oz. koga pokličete ob nujni okvari (npr. puščanje vode)?</w:t>
+      </w:r>
+    </w:p>
+    <w:p>
+      <w:pPr>
+        <w:ind w:left="283"/>
+      </w:pPr>
       <w:r>
         <w:rPr>
           <w:b w:val="0"/>
           <w:i w:val="0"/>
         </w:rPr>
-        <w:t>Kje (ulica / kraj / št. na zemljevidu): _________________________________</w:t>
-      </w:r>
-    </w:p>
-    <w:p>
+        <w:t>☐  Da     ☐  Ne</w:t>
+      </w:r>
+    </w:p>
+    <w:p>
+      <w:pPr>
+        <w:keepNext/>
+        <w:spacing w:before="160"/>
+      </w:pPr>
+      <w:r>
+        <w:rPr>
+          <w:b/>
+          <w:i w:val="0"/>
+        </w:rPr>
+        <w:t>Ali se udeležujete zborov etažnih lastnikov (vhoda ali bloka)?</w:t>
+      </w:r>
+    </w:p>
+    <w:p>
+      <w:pPr>
+        <w:ind w:left="283"/>
+      </w:pPr>
       <w:r>
         <w:rPr>
           <w:b w:val="0"/>
           <w:i w:val="0"/>
         </w:rPr>
-        <w:t>Natančneje (neobvezno): ____________________________________________________</w:t>
-      </w:r>
-    </w:p>
-    <w:p>
+        <w:t>☐  Redno</w:t>
+      </w:r>
+    </w:p>
+    <w:p>
+      <w:pPr>
+        <w:ind w:left="283"/>
+      </w:pPr>
       <w:r>
         <w:rPr>
           <w:b w:val="0"/>
           <w:i w:val="0"/>
         </w:rPr>
-      </w:r>
-    </w:p>
-    <w:p>
+        <w:t>☐  Občasno</w:t>
+      </w:r>
+    </w:p>
+    <w:p>
+      <w:pPr>
+        <w:ind w:left="283"/>
+      </w:pPr>
       <w:r>
         <w:rPr>
           <w:b w:val="0"/>
           <w:i w:val="0"/>
         </w:rPr>
-        <w:t>☐  Ne vem / velja za celo naselje</w:t>
+        <w:t>☐  Glasujem pisno (glasovnice v nabiralniku)</w:t>
+      </w:r>
+    </w:p>
+    <w:p>
+      <w:pPr>
+        <w:ind w:left="283"/>
+      </w:pPr>
+      <w:r>
+        <w:rPr>
+          <w:b w:val="0"/>
+          <w:i w:val="0"/>
+        </w:rPr>
+        <w:t>☐  Ne, ker ne vem zanje</w:t>
+      </w:r>
+    </w:p>
+    <w:p>
+      <w:pPr>
+        <w:ind w:left="283"/>
+      </w:pPr>
+      <w:r>
+        <w:rPr>
+          <w:b w:val="0"/>
+          <w:i w:val="0"/>
+        </w:rPr>
+        <w:t>☐  Ne</w:t>
+      </w:r>
+    </w:p>
+    <w:p>
+      <w:pPr>
+        <w:ind w:left="283"/>
+      </w:pPr>
+      <w:r>
+        <w:rPr>
+          <w:b w:val="0"/>
+          <w:i w:val="0"/>
+        </w:rPr>
+        <w:t>☐  Sem najemnik(-ca)</w:t>
+      </w:r>
+    </w:p>
+    <w:p>
+      <w:pPr>
+        <w:spacing w:before="120"/>
+      </w:pPr>
+      <w:r>
+        <w:rPr>
+          <w:b w:val="0"/>
+          <w:i/>
+        </w:rPr>
+        <w:t>► Če niste odgovorili »Redno« ali »Sem najemnik(-ca)«:</w:t>
+      </w:r>
+    </w:p>
+    <w:p>
+      <w:pPr>
+        <w:keepNext/>
+        <w:spacing w:before="80"/>
+      </w:pPr>
+      <w:r>
+        <w:rPr>
+          <w:b/>
+          <w:i w:val="0"/>
+        </w:rPr>
+        <w:t>Kaj bi vam pomagalo, da bi prišli?</w:t>
+      </w:r>
+    </w:p>
+    <w:p>
+      <w:pPr>
+        <w:keepNext/>
+      </w:pPr>
+      <w:r>
+        <w:rPr>
+          <w:b w:val="0"/>
+          <w:i/>
+          <w:sz w:val="20"/>
+        </w:rPr>
+        <w:t>Izberete lahko več odgovorov.</w:t>
+      </w:r>
+    </w:p>
+    <w:p>
+      <w:pPr>
+        <w:ind w:left="283"/>
+      </w:pPr>
+      <w:r>
+        <w:rPr>
+          <w:b w:val="0"/>
+          <w:i w:val="0"/>
+        </w:rPr>
+        <w:t>☐  boljše obveščanje</w:t>
+      </w:r>
+    </w:p>
+    <w:p>
+      <w:pPr>
+        <w:ind w:left="283"/>
+      </w:pPr>
+      <w:r>
+        <w:rPr>
+          <w:b w:val="0"/>
+          <w:i w:val="0"/>
+        </w:rPr>
+        <w:t>☐  obvestilo na oglasni deski v vhodu</w:t>
+      </w:r>
+    </w:p>
+    <w:p>
+      <w:pPr>
+        <w:ind w:left="283"/>
+      </w:pPr>
+      <w:r>
+        <w:rPr>
+          <w:b w:val="0"/>
+          <w:i w:val="0"/>
+        </w:rPr>
+        <w:t>☐  primernejša ura</w:t>
+      </w:r>
+    </w:p>
+    <w:p>
+      <w:pPr>
+        <w:ind w:left="283"/>
+      </w:pPr>
+      <w:r>
+        <w:rPr>
+          <w:b w:val="0"/>
+          <w:i w:val="0"/>
+        </w:rPr>
+        <w:t>☐  krajši zbori</w:t>
+      </w:r>
+    </w:p>
+    <w:p>
+      <w:pPr>
+        <w:ind w:left="283"/>
+      </w:pPr>
+      <w:r>
+        <w:rPr>
+          <w:b w:val="0"/>
+          <w:i w:val="0"/>
+        </w:rPr>
+        <w:t>☐  spletna udeležba</w:t>
+      </w:r>
+    </w:p>
+    <w:p>
+      <w:pPr>
+        <w:ind w:left="283"/>
+      </w:pPr>
+      <w:r>
+        <w:rPr>
+          <w:b w:val="0"/>
+          <w:i w:val="0"/>
+        </w:rPr>
+        <w:t>☐  glasovanje na daljavo / e-glasovanje</w:t>
+      </w:r>
+    </w:p>
+    <w:p>
+      <w:pPr>
+        <w:ind w:left="283"/>
+      </w:pPr>
+      <w:r>
+        <w:rPr>
+          <w:b w:val="0"/>
+          <w:i w:val="0"/>
+        </w:rPr>
+        <w:t>☐  drugo</w:t>
+      </w:r>
+    </w:p>
+    <w:p>
+      <w:pPr>
+        <w:keepNext/>
+        <w:spacing w:before="160"/>
+      </w:pPr>
+      <w:r>
+        <w:rPr>
+          <w:b/>
+          <w:i w:val="0"/>
+        </w:rPr>
+        <w:t>Ali bi bili pripravljeni biti predstavnik/-ca vhoda?</w:t>
+      </w:r>
+    </w:p>
+    <w:p>
+      <w:pPr>
+        <w:ind w:left="283"/>
+      </w:pPr>
+      <w:r>
+        <w:rPr>
+          <w:b w:val="0"/>
+          <w:i w:val="0"/>
+        </w:rPr>
+        <w:t>☐  Da     ☐  Morda     ☐  Ne</w:t>
+      </w:r>
+    </w:p>
+    <w:p>
+      <w:r>
+        <w:rPr>
+          <w:b w:val="0"/>
+          <w:i/>
+        </w:rPr>
+        <w:t>Če ste odgovorili »Da« ali »Morda«: Hvala! Da anketa ostane anonimna, kontakta tu ne zbiramo. Na koncu je ločen modri listek (kontaktni obrazec), ki z odgovori ni povezan.</w:t>
+      </w:r>
+    </w:p>
+    <w:p>
+      <w:pPr>
+        <w:pStyle w:val="Heading2"/>
+        <w:keepNext/>
+      </w:pPr>
+      <w:r>
+        <w:t>9. Zdravstvo</w:t>
+      </w:r>
+    </w:p>
+    <w:p>
+      <w:pPr>
+        <w:keepNext/>
+      </w:pPr>
+      <w:r>
+        <w:t>Za vse (razen mlajših od 15 let)</w:t>
+      </w:r>
+    </w:p>
+    <w:p>
+      <w:pPr>
+        <w:keepNext/>
+      </w:pPr>
+      <w:r>
+        <w:t>Vsa vprašanja so neobvezna. Sprašujemo samo o dostopu, ne o boleznih ali politiki.</w:t>
+      </w:r>
+    </w:p>
+    <w:p>
+      <w:pPr>
+        <w:keepNext/>
+      </w:pPr>
+      <w:r>
+        <w:t>Kako ste zadovoljni z dostopom do zdravstvenih storitev v bližini?</w:t>
+      </w:r>
+    </w:p>
+    <w:p>
+      <w:pPr>
+        <w:keepNext/>
+      </w:pPr>
+      <w:r>
+        <w:t>1 = zelo slabo, 5 = zelo dobro.</w:t>
+      </w:r>
+    </w:p>
+    <w:p>
+      <w:pPr>
+        <w:keepNext/>
+      </w:pPr>
+      <w:r>
+        <w:t>☐  1     ☐  2     ☐  3     ☐  4     ☐  5     ☐  Ne uporabljam</w:t>
+      </w:r>
+    </w:p>
+    <w:p>
+      <w:pPr>
+        <w:keepNext/>
+      </w:pPr>
+      <w:r>
+        <w:t>Kaj vam najbolj manjka? (lahko več)</w:t>
+      </w:r>
+    </w:p>
+    <w:p>
+      <w:pPr>
+        <w:keepNext/>
+      </w:pPr>
+      <w:r>
+        <w:t>☐  Osebni zdravnik     ☐  Pediater     ☐  Zobozdravnik</w:t>
+      </w:r>
+    </w:p>
+    <w:p>
+      <w:pPr>
+        <w:keepNext/>
+      </w:pPr>
+      <w:r>
+        <w:t>☐  Specialisti     ☐  Urgenca / dežurna služba     ☐  Nič</w:t>
+      </w:r>
+    </w:p>
+    <w:p>
+      <w:pPr>
+        <w:pStyle w:val="Heading2"/>
+        <w:keepNext/>
+      </w:pPr>
+      <w:r>
+        <w:t>10. Koliko ste stari?</w:t>
+      </w:r>
+    </w:p>
+    <w:p>
+      <w:r>
+        <w:rPr>
+          <w:b w:val="0"/>
+          <w:i/>
+          <w:sz w:val="18"/>
+        </w:rPr>
+        <w:t>O vas</w:t>
+      </w:r>
+    </w:p>
+    <w:p>
+      <w:r>
+        <w:rPr>
+          <w:b w:val="0"/>
+          <w:i w:val="0"/>
+        </w:rPr>
+        <w:t>Glede na starost izpolnite še kratka vprašanja za svojo starostno skupino (13. in 14. korak).</w:t>
+      </w:r>
+    </w:p>
+    <w:p>
+      <w:pPr>
+        <w:ind w:left="283"/>
+      </w:pPr>
+      <w:r>
+        <w:rPr>
+          <w:b w:val="0"/>
+          <w:i w:val="0"/>
+        </w:rPr>
+        <w:t>☐  mlajši od 15 let     ☐  15–24     ☐  25–34     ☐  35–49</w:t>
+      </w:r>
+    </w:p>
+    <w:p>
+      <w:pPr>
+        <w:ind w:left="283"/>
+      </w:pPr>
+      <w:r>
+        <w:rPr>
+          <w:b w:val="0"/>
+          <w:i w:val="0"/>
+        </w:rPr>
+        <w:t>☐  50–64     ☐  65–74     ☐  75 ali več</w:t>
+      </w:r>
+    </w:p>
+    <w:p>
+      <w:r>
+        <w:rPr>
+          <w:b w:val="0"/>
+          <w:i/>
+        </w:rPr>
+        <w:t>Če ste mlajši od 15 let: Hvala, ker te zanima naše naselje! Ta anketa je za prebivalce od 15. leta naprej. Otroke bomo vprašali v šoli: v razredu boste skupaj glasovali, kaj bi v naselju spremenili. Lahko pa že zdaj staršem poveš, kaj si želiš. Oni lahko to zapišejo v svojo anketo.</w:t>
+      </w:r>
+    </w:p>
+    <w:p>
+      <w:pPr>
+        <w:pStyle w:val="Heading2"/>
+        <w:keepNext/>
+      </w:pPr>
+      <w:r>
+        <w:t>11. Kje in kako živite?</w:t>
+      </w:r>
+    </w:p>
+    <w:p>
+      <w:r>
+        <w:rPr>
+          <w:b w:val="0"/>
+          <w:i/>
+          <w:sz w:val="18"/>
+        </w:rPr>
+        <w:t>O vas</w:t>
+      </w:r>
+    </w:p>
+    <w:p>
+      <w:pPr>
+        <w:keepNext/>
+        <w:spacing w:before="160"/>
+      </w:pPr>
+      <w:r>
+        <w:rPr>
+          <w:b/>
+          <w:i w:val="0"/>
+        </w:rPr>
+        <w:t>Na kateri ulici živite?</w:t>
+      </w:r>
+    </w:p>
+    <w:p>
+      <w:pPr>
+        <w:keepNext/>
+      </w:pPr>
+      <w:r>
+        <w:rPr>
+          <w:b w:val="0"/>
+          <w:i/>
+          <w:sz w:val="20"/>
+        </w:rPr>
+        <w:t>Podatek o ulici nam pomaga preveriti, ali so v anketi zastopani prebivalci vseh delov naselja. Hišne številke ne zbiramo.</w:t>
+      </w:r>
+    </w:p>
+    <w:p>
+      <w:pPr>
+        <w:ind w:left="283"/>
+      </w:pPr>
+      <w:r>
+        <w:rPr>
+          <w:b w:val="0"/>
+          <w:i w:val="0"/>
+        </w:rPr>
+        <w:t>☐  Belokranjska     ☐  Dečkova ploščad     ☐  Endliherjeva</w:t>
+      </w:r>
+    </w:p>
+    <w:p>
+      <w:pPr>
+        <w:ind w:left="283"/>
+      </w:pPr>
+      <w:r>
+        <w:rPr>
+          <w:b w:val="0"/>
+          <w:i w:val="0"/>
+        </w:rPr>
+        <w:t>☐  Fabianijeva     ☐  Knobleharjeva     ☐  Linhartova</w:t>
+      </w:r>
+    </w:p>
+    <w:p>
+      <w:pPr>
+        <w:ind w:left="283"/>
+      </w:pPr>
+      <w:r>
+        <w:rPr>
+          <w:b w:val="0"/>
+          <w:i w:val="0"/>
+        </w:rPr>
+        <w:t>☐  Luize Pesjakove     ☐  Majaronova     ☐  Matjaževa</w:t>
+      </w:r>
+    </w:p>
+    <w:p>
+      <w:pPr>
+        <w:ind w:left="283"/>
+      </w:pPr>
+      <w:r>
+        <w:rPr>
+          <w:b w:val="0"/>
+          <w:i w:val="0"/>
+        </w:rPr>
+        <w:t>☐  Mikuževa     ☐  Mislejeva     ☐  Savska</w:t>
+      </w:r>
+    </w:p>
+    <w:p>
+      <w:pPr>
+        <w:ind w:left="283"/>
+      </w:pPr>
+      <w:r>
+        <w:rPr>
+          <w:b w:val="0"/>
+          <w:i w:val="0"/>
+        </w:rPr>
+        <w:t>☐  Šerkova     ☐  Topniška     ☐  drugo</w:t>
+      </w:r>
+    </w:p>
+    <w:p>
+      <w:pPr>
+        <w:keepNext/>
+        <w:spacing w:before="160"/>
+      </w:pPr>
+      <w:r>
+        <w:rPr>
+          <w:b/>
+          <w:i w:val="0"/>
+        </w:rPr>
+        <w:t>V stanovanju živite kot:</w:t>
+      </w:r>
+    </w:p>
+    <w:p>
+      <w:pPr>
+        <w:ind w:left="283"/>
+      </w:pPr>
+      <w:r>
+        <w:rPr>
+          <w:b w:val="0"/>
+          <w:i w:val="0"/>
+        </w:rPr>
+        <w:t>☐  lastnik ali družinski član lastnika</w:t>
+      </w:r>
+    </w:p>
+    <w:p>
+      <w:pPr>
+        <w:ind w:left="283"/>
+      </w:pPr>
+      <w:r>
+        <w:rPr>
+          <w:b w:val="0"/>
+          <w:i w:val="0"/>
+        </w:rPr>
+        <w:t>☐  najemnik pri JSS MOL (neprofitno)</w:t>
+      </w:r>
+    </w:p>
+    <w:p>
+      <w:pPr>
+        <w:ind w:left="283"/>
+      </w:pPr>
+      <w:r>
+        <w:rPr>
+          <w:b w:val="0"/>
+          <w:i w:val="0"/>
+        </w:rPr>
+        <w:t>☐  najemnik pri zasebniku</w:t>
+      </w:r>
+    </w:p>
+    <w:p>
+      <w:pPr>
+        <w:ind w:left="283"/>
+      </w:pPr>
+      <w:r>
+        <w:rPr>
+          <w:b w:val="0"/>
+          <w:i w:val="0"/>
+        </w:rPr>
+        <w:t>☐  drugo</w:t>
+      </w:r>
+    </w:p>
+    <w:p>
+      <w:pPr>
+        <w:ind w:left="283"/>
+      </w:pPr>
+      <w:r>
+        <w:rPr>
+          <w:b w:val="0"/>
+          <w:i w:val="0"/>
+        </w:rPr>
+        <w:t>☐  Ne želim odgovoriti</w:t>
+      </w:r>
+    </w:p>
+    <w:p>
+      <w:pPr>
+        <w:keepNext/>
+        <w:spacing w:before="160"/>
+      </w:pPr>
+      <w:r>
+        <w:rPr>
+          <w:b/>
+          <w:i w:val="0"/>
+        </w:rPr>
+        <w:t>Ima vaš blok (vhod) dvigalo?</w:t>
+      </w:r>
+    </w:p>
+    <w:p>
+      <w:pPr>
+        <w:ind w:left="283"/>
+      </w:pPr>
+      <w:r>
+        <w:rPr>
+          <w:b w:val="0"/>
+          <w:i w:val="0"/>
+        </w:rPr>
+        <w:t>☐  da     ☐  ne     ☐  ne vem</w:t>
+      </w:r>
+    </w:p>
+    <w:p>
+      <w:pPr>
+        <w:pStyle w:val="Heading2"/>
+        <w:keepNext/>
+      </w:pPr>
+      <w:r>
+        <w:t>12. Promet na vaši ulici</w:t>
+      </w:r>
+    </w:p>
+    <w:p>
+      <w:r>
+        <w:rPr>
+          <w:b w:val="0"/>
+          <w:i/>
+          <w:sz w:val="18"/>
+        </w:rPr>
+        <w:t>Za vse</w:t>
+      </w:r>
+    </w:p>
+    <w:p>
+      <w:pPr>
+        <w:keepNext/>
+        <w:spacing w:before="160"/>
+      </w:pPr>
+      <w:r>
+        <w:rPr>
+          <w:b/>
+          <w:i w:val="0"/>
+        </w:rPr>
+        <w:t>Bi podprli enosmerni promet na svoji ulici?</w:t>
+      </w:r>
+    </w:p>
+    <w:p>
+      <w:pPr>
+        <w:keepNext/>
+      </w:pPr>
+      <w:r>
+        <w:rPr>
+          <w:b w:val="0"/>
+          <w:i/>
+          <w:sz w:val="20"/>
+        </w:rPr>
+        <w:t>Vaš odgovor ne pomeni uradne zaveze. Pomaga nam razumeti, kako stanovalci posameznih ulic gledajo na uvedbo enosmernega prometa.</w:t>
+      </w:r>
+    </w:p>
+    <w:p>
+      <w:pPr>
+        <w:ind w:left="283"/>
+      </w:pPr>
+      <w:r>
+        <w:rPr>
+          <w:b w:val="0"/>
+          <w:i w:val="0"/>
+        </w:rPr>
+        <w:t>☐  da     ☐  ne     ☐  ne vem</w:t>
+      </w:r>
+    </w:p>
+    <w:p>
+      <w:pPr>
+        <w:pStyle w:val="Heading2"/>
+      </w:pPr>
+      <w:r>
+        <w:t>14.–15. Vprašanja za vašo starostno skupino</w:t>
+      </w:r>
+    </w:p>
+    <w:p>
+      <w:r>
+        <w:rPr>
+          <w:b w:val="0"/>
+          <w:i/>
+        </w:rPr>
+        <w:t>Izpolnite samo del za svojo starostno skupino.</w:t>
+      </w:r>
+    </w:p>
+    <w:p>
+      <w:pPr>
+        <w:pStyle w:val="Heading3"/>
+      </w:pPr>
+      <w:r>
+        <w:t>Za 65 let in več (65–74, 75 ali več)</w:t>
+      </w:r>
+    </w:p>
+    <w:p>
+      <w:r>
+        <w:rPr>
+          <w:b/>
+          <w:i w:val="0"/>
+        </w:rPr>
+        <w:t>13. Stopnice, dvigala in klopi</w:t>
+      </w:r>
+    </w:p>
+    <w:p>
+      <w:pPr>
+        <w:spacing w:before="120"/>
+      </w:pPr>
+      <w:r>
+        <w:rPr>
+          <w:b w:val="0"/>
+          <w:i/>
+        </w:rPr>
+        <w:t>► Če vaš blok (vhod) nima dvigala ali ne veste:</w:t>
+      </w:r>
+    </w:p>
+    <w:p>
+      <w:pPr>
+        <w:keepNext/>
+        <w:spacing w:before="80"/>
+      </w:pPr>
+      <w:r>
+        <w:rPr>
+          <w:b/>
+          <w:i w:val="0"/>
+        </w:rPr>
+        <w:t>Vam ali komu v gospodinjstvu stopnice otežujejo vsakdan?</w:t>
+      </w:r>
+    </w:p>
+    <w:p>
+      <w:pPr>
+        <w:ind w:left="283"/>
+      </w:pPr>
+      <w:r>
+        <w:rPr>
+          <w:b w:val="0"/>
+          <w:i w:val="0"/>
+        </w:rPr>
+        <w:t>☐  pogosto     ☐  včasih     ☐  ne</w:t>
+      </w:r>
+    </w:p>
+    <w:p>
+      <w:pPr>
+        <w:spacing w:before="120"/>
+      </w:pPr>
+      <w:r>
+        <w:rPr>
+          <w:b w:val="0"/>
+          <w:i/>
+        </w:rPr>
+        <w:t>► Če vaš blok (vhod) nima dvigala ali ne veste:</w:t>
+      </w:r>
+    </w:p>
+    <w:p>
+      <w:pPr>
+        <w:keepNext/>
+        <w:spacing w:before="80"/>
+      </w:pPr>
+      <w:r>
+        <w:rPr>
+          <w:b/>
+          <w:i w:val="0"/>
+        </w:rPr>
+        <w:t>Bi podprli vgradnjo dvigala v vašem vhodu?</w:t>
+      </w:r>
+    </w:p>
+    <w:p>
+      <w:pPr>
+        <w:ind w:left="283"/>
+      </w:pPr>
+      <w:r>
+        <w:rPr>
+          <w:b w:val="0"/>
+          <w:i w:val="0"/>
+        </w:rPr>
+        <w:t>☐  da, tudi z lastnim deležem stroškov     ☐  da, če večino plača subvencija</w:t>
+      </w:r>
+    </w:p>
+    <w:p>
+      <w:pPr>
+        <w:ind w:left="283"/>
+      </w:pPr>
+      <w:r>
+        <w:rPr>
+          <w:b w:val="0"/>
+          <w:i w:val="0"/>
+        </w:rPr>
+        <w:t>☐  ne     ☐  ne vem</w:t>
+      </w:r>
+    </w:p>
+    <w:p>
+      <w:pPr>
+        <w:keepNext/>
+        <w:spacing w:before="160"/>
+      </w:pPr>
+      <w:r>
+        <w:rPr>
+          <w:b/>
+          <w:i w:val="0"/>
+        </w:rPr>
+        <w:t>Ali na poteh, ki jih pogosto prehodite, pogrešate klop za počitek?</w:t>
+      </w:r>
+    </w:p>
+    <w:p>
+      <w:pPr>
+        <w:ind w:left="283"/>
+      </w:pPr>
+      <w:r>
+        <w:rPr>
+          <w:b w:val="0"/>
+          <w:i w:val="0"/>
+        </w:rPr>
+        <w:t>☐  da, pogosto     ☐  včasih     ☐  ne</w:t>
+      </w:r>
+    </w:p>
+    <w:p>
+      <w:pPr>
+        <w:keepNext/>
+        <w:spacing w:before="160"/>
+      </w:pPr>
+      <w:r>
+        <w:rPr>
+          <w:b/>
+          <w:i w:val="0"/>
+        </w:rPr>
+        <w:t>Kje bi klop najbolj prav prišla?</w:t>
+      </w:r>
+    </w:p>
+    <w:p>
+      <w:pPr>
+        <w:spacing w:after="160"/>
+      </w:pPr>
+      <w:r>
+        <w:rPr>
+          <w:b w:val="0"/>
+          <w:i w:val="0"/>
+        </w:rPr>
+        <w:t>______________________________________________________________________________________</w:t>
       </w:r>
     </w:p>
     <w:p>
@@ -1059,26 +2528,6 @@
     </w:p>
     <w:p>
       <w:pPr>
-        <w:pStyle w:val="Heading2"/>
-        <w:keepNext/>
-      </w:pPr>
-      <w:r>
-        <w:t>6. Čistilni četrtek</w:t>
-      </w:r>
-    </w:p>
-    <w:p>
-      <w:r>
-        <w:rPr>
-          <w:b w:val="0"/>
-          <w:i/>
-          <w:sz w:val="18"/>
-        </w:rPr>
-        <w:t>Za vse</w:t>
-      </w:r>
-    </w:p>
-    <w:p>
-      <w:pPr>
-        <w:keepNext/>
         <w:spacing w:before="160"/>
       </w:pPr>
       <w:r>
@@ -1086,20 +2535,20 @@
           <w:b/>
           <w:i w:val="0"/>
         </w:rPr>
-        <w:t>Ali podpirate Čistilni četrtek, ko bi vsi prebivalci skupaj in prostovoljno enkrat na teden očistili Savsko naselje?</w:t>
+        <w:t>14. Vsakdan in sosedje</w:t>
       </w:r>
     </w:p>
     <w:p>
       <w:pPr>
         <w:keepNext/>
+        <w:spacing w:before="160"/>
       </w:pPr>
       <w:r>
         <w:rPr>
-          <w:b w:val="0"/>
-          <w:i/>
-          <w:sz w:val="20"/>
+          <w:b/>
+          <w:i w:val="0"/>
         </w:rPr>
-        <w:t>Neobvezno.</w:t>
+        <w:t>Kako pridete do trgovine?</w:t>
       </w:r>
     </w:p>
     <w:p>
@@ -1111,35 +2560,32 @@
           <w:b w:val="0"/>
           <w:i w:val="0"/>
         </w:rPr>
-        <w:t>☐  Da, podpiram     ☐  Morda     ☐  Ne</w:t>
-      </w:r>
-    </w:p>
-    <w:p>
-      <w:pPr>
-        <w:pStyle w:val="Heading2"/>
+        <w:t>☐  brez težav     ☐  s težavo     ☐  sam(a) ne morem</w:t>
+      </w:r>
+    </w:p>
+    <w:p>
+      <w:pPr>
         <w:keepNext/>
-      </w:pPr>
-      <w:r>
-        <w:t>7. Vozila, parkiranje in promet</w:t>
-      </w:r>
-    </w:p>
-    <w:p>
+        <w:spacing w:before="160"/>
+      </w:pPr>
       <w:r>
         <w:rPr>
-          <w:b w:val="0"/>
-          <w:i/>
-          <w:sz w:val="18"/>
+          <w:b/>
+          <w:i w:val="0"/>
         </w:rPr>
-        <w:t>Za vse</w:t>
-      </w:r>
-    </w:p>
-    <w:p>
+        <w:t>Kako pridete do zdravnika ali lekarne?</w:t>
+      </w:r>
+    </w:p>
+    <w:p>
+      <w:pPr>
+        <w:ind w:left="283"/>
+      </w:pPr>
       <w:r>
         <w:rPr>
           <w:b w:val="0"/>
           <w:i w:val="0"/>
         </w:rPr>
-        <w:t>Vsa vprašanja so neobvezna.</w:t>
+        <w:t>☐  brez težav     ☐  s težavo     ☐  sam(a) ne morem</w:t>
       </w:r>
     </w:p>
     <w:p>
@@ -1152,20 +2598,7 @@
           <w:b/>
           <w:i w:val="0"/>
         </w:rPr>
-        <w:t>Koliko vozil (avtomobilov) je v vašem gospodinjstvu?</w:t>
-      </w:r>
-    </w:p>
-    <w:p>
-      <w:pPr>
-        <w:keepNext/>
-      </w:pPr>
-      <w:r>
-        <w:rPr>
-          <w:b w:val="0"/>
-          <w:i/>
-          <w:sz w:val="20"/>
-        </w:rPr>
-        <w:t>Če izberete 0, vprašanja o parkiranju preskočite.</w:t>
+        <w:t>Koliko dni v tednu se s kom pogovarjate, v živo ali po telefonu?</w:t>
       </w:r>
     </w:p>
     <w:p>
@@ -1177,1114 +2610,20 @@
           <w:b w:val="0"/>
           <w:i w:val="0"/>
         </w:rPr>
-        <w:t>☐  0     ☐  1     ☐  2     ☐  3 ali več</w:t>
-      </w:r>
-    </w:p>
-    <w:p>
-      <w:pPr>
-        <w:spacing w:before="120"/>
-      </w:pPr>
-      <w:r>
-        <w:rPr>
-          <w:b w:val="0"/>
-          <w:i/>
-        </w:rPr>
-        <w:t>► Če imate vsaj 1 vozilo:</w:t>
+        <w:t>☐  vsak dan     ☐  3–6 dni     ☐  1–2 dni     ☐  manj kot enkrat na teden</w:t>
       </w:r>
     </w:p>
     <w:p>
       <w:pPr>
         <w:keepNext/>
-        <w:spacing w:before="80"/>
+        <w:spacing w:before="160"/>
       </w:pPr>
       <w:r>
         <w:rPr>
           <w:b/>
           <w:i w:val="0"/>
         </w:rPr>
-        <w:t>Kje najpogosteje parkirate ponoči?</w:t>
-      </w:r>
-    </w:p>
-    <w:p>
-      <w:pPr>
-        <w:ind w:left="283"/>
-      </w:pPr>
-      <w:r>
-        <w:rPr>
-          <w:b w:val="0"/>
-          <w:i w:val="0"/>
-        </w:rPr>
-        <w:t>☐  na urejenem parkirišču ob bloku</w:t>
-      </w:r>
-    </w:p>
-    <w:p>
-      <w:pPr>
-        <w:ind w:left="283"/>
-      </w:pPr>
-      <w:r>
-        <w:rPr>
-          <w:b w:val="0"/>
-          <w:i w:val="0"/>
-        </w:rPr>
-        <w:t>☐  na ulici</w:t>
-      </w:r>
-    </w:p>
-    <w:p>
-      <w:pPr>
-        <w:ind w:left="283"/>
-      </w:pPr>
-      <w:r>
-        <w:rPr>
-          <w:b w:val="0"/>
-          <w:i w:val="0"/>
-        </w:rPr>
-        <w:t>☐  v garaži ali na najetem mestu</w:t>
-      </w:r>
-    </w:p>
-    <w:p>
-      <w:pPr>
-        <w:ind w:left="283"/>
-      </w:pPr>
-      <w:r>
-        <w:rPr>
-          <w:b w:val="0"/>
-          <w:i w:val="0"/>
-        </w:rPr>
-        <w:t>☐  kjer najdem prostor, tudi na zelenici ali pločniku</w:t>
-      </w:r>
-    </w:p>
-    <w:p>
-      <w:pPr>
-        <w:spacing w:before="120"/>
-      </w:pPr>
-      <w:r>
-        <w:rPr>
-          <w:b w:val="0"/>
-          <w:i/>
-        </w:rPr>
-        <w:t>► Če imate vsaj 1 vozilo:</w:t>
-      </w:r>
-    </w:p>
-    <w:p>
-      <w:pPr>
-        <w:keepNext/>
-        <w:spacing w:before="80"/>
-      </w:pPr>
-      <w:r>
-        <w:rPr>
-          <w:b/>
-          <w:i w:val="0"/>
-        </w:rPr>
-        <w:t>Kako pogosto imate težave s parkiranjem?</w:t>
-      </w:r>
-    </w:p>
-    <w:p>
-      <w:pPr>
-        <w:ind w:left="283"/>
-      </w:pPr>
-      <w:r>
-        <w:rPr>
-          <w:b w:val="0"/>
-          <w:i w:val="0"/>
-        </w:rPr>
-        <w:t>☐  Pogosto     ☐  Včasih     ☐  Ne</w:t>
-      </w:r>
-    </w:p>
-    <w:p>
-      <w:pPr>
-        <w:spacing w:before="120"/>
-      </w:pPr>
-      <w:r>
-        <w:rPr>
-          <w:b w:val="0"/>
-          <w:i/>
-        </w:rPr>
-        <w:t>► Če imate vsaj 1 vozilo:</w:t>
-      </w:r>
-    </w:p>
-    <w:p>
-      <w:pPr>
-        <w:keepNext/>
-        <w:spacing w:before="80"/>
-      </w:pPr>
-      <w:r>
-        <w:rPr>
-          <w:b/>
-          <w:i w:val="0"/>
-        </w:rPr>
-        <w:t>Bi želeli garažo ali garažno mesto?</w:t>
-      </w:r>
-    </w:p>
-    <w:p>
-      <w:pPr>
-        <w:ind w:left="283"/>
-      </w:pPr>
-      <w:r>
-        <w:rPr>
-          <w:b w:val="0"/>
-          <w:i w:val="0"/>
-        </w:rPr>
-        <w:t>☐  Da     ☐  Morda     ☐  Ne</w:t>
-      </w:r>
-    </w:p>
-    <w:p>
-      <w:pPr>
-        <w:spacing w:before="120"/>
-      </w:pPr>
-      <w:r>
-        <w:rPr>
-          <w:b w:val="0"/>
-          <w:i/>
-        </w:rPr>
-        <w:t>► Če ste pri garaži odgovorili »Da« ali »Morda«:</w:t>
-      </w:r>
-    </w:p>
-    <w:p>
-      <w:pPr>
-        <w:keepNext/>
-        <w:spacing w:before="80"/>
-      </w:pPr>
-      <w:r>
-        <w:rPr>
-          <w:b/>
-          <w:i w:val="0"/>
-        </w:rPr>
-        <w:t>Koliko bi bili zanjo pripravljeni plačati (nakup)?</w:t>
-      </w:r>
-    </w:p>
-    <w:p>
-      <w:pPr>
-        <w:ind w:left="283"/>
-      </w:pPr>
-      <w:r>
-        <w:rPr>
-          <w:b w:val="0"/>
-          <w:i w:val="0"/>
-        </w:rPr>
-        <w:t>☐  Le brezplačno     ☐  do 5.000 €</w:t>
-      </w:r>
-    </w:p>
-    <w:p>
-      <w:pPr>
-        <w:ind w:left="283"/>
-      </w:pPr>
-      <w:r>
-        <w:rPr>
-          <w:b w:val="0"/>
-          <w:i w:val="0"/>
-        </w:rPr>
-        <w:t>☐  5.000–10.000 €     ☐  10.000–20.000 €</w:t>
-      </w:r>
-    </w:p>
-    <w:p>
-      <w:pPr>
-        <w:ind w:left="283"/>
-      </w:pPr>
-      <w:r>
-        <w:rPr>
-          <w:b w:val="0"/>
-          <w:i w:val="0"/>
-        </w:rPr>
-        <w:t>☐  20.000–30.000 €     ☐  30.000–40.000 €</w:t>
-      </w:r>
-    </w:p>
-    <w:p>
-      <w:pPr>
-        <w:ind w:left="283"/>
-      </w:pPr>
-      <w:r>
-        <w:rPr>
-          <w:b w:val="0"/>
-          <w:i w:val="0"/>
-        </w:rPr>
-        <w:t>☐  več kot 40.000 €     ☐  Ne želim odgovoriti</w:t>
-      </w:r>
-    </w:p>
-    <w:p>
-      <w:pPr>
-        <w:keepNext/>
-        <w:spacing w:before="160"/>
-      </w:pPr>
-      <w:r>
-        <w:rPr>
-          <w:b/>
-          <w:i w:val="0"/>
-        </w:rPr>
-        <w:t>Kako ste zadovoljni z novo prometno ureditvijo v naselju?</w:t>
-      </w:r>
-    </w:p>
-    <w:p>
-      <w:pPr>
-        <w:ind w:left="283"/>
-      </w:pPr>
-      <w:r>
-        <w:rPr>
-          <w:b w:val="0"/>
-          <w:i w:val="0"/>
-        </w:rPr>
-        <w:t>☐  Super je     ☐  Je v redu     ☐  Slabo     ☐  Katastrofa     ☐  Ne vem</w:t>
-      </w:r>
-    </w:p>
-    <w:p>
-      <w:pPr>
-        <w:keepNext/>
-      </w:pPr>
-      <w:r>
-        <w:t>Katero prevozno sredstvo najpogosteje uporabljate za vsakodnevne poti?</w:t>
-      </w:r>
-    </w:p>
-    <w:p>
-      <w:pPr>
-        <w:keepNext/>
-      </w:pPr>
-      <w:r>
-        <w:t>Neobvezno.</w:t>
-      </w:r>
-    </w:p>
-    <w:p>
-      <w:pPr>
-        <w:keepNext/>
-      </w:pPr>
-      <w:r>
-        <w:t>☐  Peš     ☐  Kolo     ☐  JPP (avtobus)     ☐  Avto     ☐  Drugo</w:t>
-      </w:r>
-    </w:p>
-    <w:p>
-      <w:pPr>
-        <w:pStyle w:val="Heading2"/>
-        <w:keepNext/>
-      </w:pPr>
-      <w:r>
-        <w:t>8. Storitve v bližini in ohladitev</w:t>
-      </w:r>
-    </w:p>
-    <w:p>
-      <w:pPr>
-        <w:keepNext/>
-      </w:pPr>
-      <w:r>
-        <w:t>Za vse</w:t>
-      </w:r>
-    </w:p>
-    <w:p>
-      <w:pPr>
-        <w:keepNext/>
-      </w:pPr>
-      <w:r>
-        <w:t>Vsa vprašanja so neobvezna.</w:t>
-      </w:r>
-    </w:p>
-    <w:p>
-      <w:pPr>
-        <w:keepNext/>
-      </w:pPr>
-      <w:r>
-        <w:t>Katere storitve v bližini pogrešate? (lahko več)</w:t>
-      </w:r>
-    </w:p>
-    <w:p>
-      <w:pPr>
-        <w:keepNext/>
-      </w:pPr>
-      <w:r>
-        <w:t>☐  Banka     ☐  Pošta     ☐  Trgovina     ☐  Lekarna     ☐  Drugo</w:t>
-      </w:r>
-    </w:p>
-    <w:p>
-      <w:pPr>
-        <w:keepNext/>
-      </w:pPr>
-      <w:r>
-        <w:t>Če drugo – na kratko: ________________________________________________</w:t>
-      </w:r>
-    </w:p>
-    <w:p>
-      <w:pPr>
-        <w:keepNext/>
-      </w:pPr>
-      <w:r>
-        <w:t>Kam se greste v soseski poleti ohlajat?</w:t>
-      </w:r>
-    </w:p>
-    <w:p>
-      <w:pPr>
-        <w:keepNext/>
-      </w:pPr>
-      <w:r>
-        <w:t>☐  Park / senca pod drevesi     ☐  Dom skupnosti     ☐  Ob Savi</w:t>
-      </w:r>
-    </w:p>
-    <w:p>
-      <w:pPr>
-        <w:keepNext/>
-      </w:pPr>
-      <w:r>
-        <w:t>☐  Nikamor / ne zadeva me     ☐  Drugo: _______________________________</w:t>
-      </w:r>
-    </w:p>
-    <w:p>
-      <w:pPr>
-        <w:pStyle w:val="Heading2"/>
-        <w:keepNext/>
-      </w:pPr>
-      <w:r>
-        <w:t>9. Upravnik in zbori</w:t>
-      </w:r>
-    </w:p>
-    <w:p>
-      <w:r>
-        <w:rPr>
-          <w:b w:val="0"/>
-          <w:i/>
-          <w:sz w:val="18"/>
-        </w:rPr>
-        <w:t>Za vse</w:t>
-      </w:r>
-    </w:p>
-    <w:p>
-      <w:r>
-        <w:rPr>
-          <w:b w:val="0"/>
-          <w:i w:val="0"/>
-        </w:rPr>
-        <w:t>Vsa vprašanja so neobvezna. Ne sprašujemo po imenu upravnika.</w:t>
-      </w:r>
-    </w:p>
-    <w:p>
-      <w:pPr>
-        <w:keepNext/>
-        <w:spacing w:before="160"/>
-      </w:pPr>
-      <w:r>
-        <w:rPr>
-          <w:b/>
-          <w:i w:val="0"/>
-        </w:rPr>
-        <w:t>Ali veste, kdo je upravnik vašega bloka?</w:t>
-      </w:r>
-    </w:p>
-    <w:p>
-      <w:pPr>
-        <w:ind w:left="283"/>
-      </w:pPr>
-      <w:r>
-        <w:rPr>
-          <w:b w:val="0"/>
-          <w:i w:val="0"/>
-        </w:rPr>
-        <w:t>☐  Da     ☐  Ne</w:t>
-      </w:r>
-    </w:p>
-    <w:p>
-      <w:pPr>
-        <w:spacing w:before="120"/>
-      </w:pPr>
-      <w:r>
-        <w:rPr>
-          <w:b w:val="0"/>
-          <w:i/>
-        </w:rPr>
-        <w:t>► Če ste odgovorili »Da«:</w:t>
-      </w:r>
-    </w:p>
-    <w:p>
-      <w:pPr>
-        <w:keepNext/>
-        <w:spacing w:before="80"/>
-      </w:pPr>
-      <w:r>
-        <w:rPr>
-          <w:b/>
-          <w:i w:val="0"/>
-        </w:rPr>
-        <w:t>Kako ste zadovoljni z upravnikom?</w:t>
-      </w:r>
-    </w:p>
-    <w:p>
-      <w:pPr>
-        <w:ind w:left="283"/>
-      </w:pPr>
-      <w:r>
-        <w:rPr>
-          <w:b w:val="0"/>
-          <w:i w:val="0"/>
-        </w:rPr>
-        <w:t>Odzivnost:</w:t>
-      </w:r>
-    </w:p>
-    <w:p>
-      <w:pPr>
-        <w:ind w:left="567"/>
-      </w:pPr>
-      <w:r>
-        <w:rPr>
-          <w:b w:val="0"/>
-          <w:i w:val="0"/>
-        </w:rPr>
-        <w:t>☐  Zelo     ☐  Kar     ☐  Malo     ☐  Sploh ne     ☐  Ne vem</w:t>
-      </w:r>
-    </w:p>
-    <w:p>
-      <w:pPr>
-        <w:ind w:left="283"/>
-      </w:pPr>
-      <w:r>
-        <w:rPr>
-          <w:b w:val="0"/>
-          <w:i w:val="0"/>
-        </w:rPr>
-        <w:t>Vzdrževanje in čistoča:</w:t>
-      </w:r>
-    </w:p>
-    <w:p>
-      <w:pPr>
-        <w:ind w:left="567"/>
-      </w:pPr>
-      <w:r>
-        <w:rPr>
-          <w:b w:val="0"/>
-          <w:i w:val="0"/>
-        </w:rPr>
-        <w:t>☐  Zelo     ☐  Kar     ☐  Malo     ☐  Sploh ne     ☐  Ne vem</w:t>
-      </w:r>
-    </w:p>
-    <w:p>
-      <w:pPr>
-        <w:ind w:left="283"/>
-      </w:pPr>
-      <w:r>
-        <w:rPr>
-          <w:b w:val="0"/>
-          <w:i w:val="0"/>
-        </w:rPr>
-        <w:t>Stroški:</w:t>
-      </w:r>
-    </w:p>
-    <w:p>
-      <w:pPr>
-        <w:ind w:left="567"/>
-      </w:pPr>
-      <w:r>
-        <w:rPr>
-          <w:b w:val="0"/>
-          <w:i w:val="0"/>
-        </w:rPr>
-        <w:t>☐  Zelo     ☐  Kar     ☐  Malo     ☐  Sploh ne     ☐  Ne vem</w:t>
-      </w:r>
-    </w:p>
-    <w:p>
-      <w:pPr>
-        <w:ind w:left="283"/>
-      </w:pPr>
-      <w:r>
-        <w:rPr>
-          <w:b w:val="0"/>
-          <w:i w:val="0"/>
-        </w:rPr>
-        <w:t>Obveščanje:</w:t>
-      </w:r>
-    </w:p>
-    <w:p>
-      <w:pPr>
-        <w:ind w:left="567"/>
-      </w:pPr>
-      <w:r>
-        <w:rPr>
-          <w:b w:val="0"/>
-          <w:i w:val="0"/>
-        </w:rPr>
-        <w:t>☐  Zelo     ☐  Kar     ☐  Malo     ☐  Sploh ne     ☐  Ne vem</w:t>
-      </w:r>
-    </w:p>
-    <w:p>
-      <w:pPr>
-        <w:keepNext/>
-        <w:spacing w:before="160"/>
-      </w:pPr>
-      <w:r>
-        <w:rPr>
-          <w:b/>
-          <w:i w:val="0"/>
-        </w:rPr>
-        <w:t>Ali veste, kdo je vaš hišnik oz. koga pokličete ob nujni okvari (npr. puščanje vode)?</w:t>
-      </w:r>
-    </w:p>
-    <w:p>
-      <w:pPr>
-        <w:ind w:left="283"/>
-      </w:pPr>
-      <w:r>
-        <w:rPr>
-          <w:b w:val="0"/>
-          <w:i w:val="0"/>
-        </w:rPr>
-        <w:t>☐  Da     ☐  Ne</w:t>
-      </w:r>
-    </w:p>
-    <w:p>
-      <w:pPr>
-        <w:keepNext/>
-        <w:spacing w:before="160"/>
-      </w:pPr>
-      <w:r>
-        <w:rPr>
-          <w:b/>
-          <w:i w:val="0"/>
-        </w:rPr>
-        <w:t>Ali se udeležujete zborov etažnih lastnikov (vhoda ali bloka)?</w:t>
-      </w:r>
-    </w:p>
-    <w:p>
-      <w:pPr>
-        <w:ind w:left="283"/>
-      </w:pPr>
-      <w:r>
-        <w:rPr>
-          <w:b w:val="0"/>
-          <w:i w:val="0"/>
-        </w:rPr>
-        <w:t>☐  Redno</w:t>
-      </w:r>
-    </w:p>
-    <w:p>
-      <w:pPr>
-        <w:ind w:left="283"/>
-      </w:pPr>
-      <w:r>
-        <w:rPr>
-          <w:b w:val="0"/>
-          <w:i w:val="0"/>
-        </w:rPr>
-        <w:t>☐  Občasno</w:t>
-      </w:r>
-    </w:p>
-    <w:p>
-      <w:pPr>
-        <w:ind w:left="283"/>
-      </w:pPr>
-      <w:r>
-        <w:rPr>
-          <w:b w:val="0"/>
-          <w:i w:val="0"/>
-        </w:rPr>
-        <w:t>☐  Glasujem pisno (glasovnice v nabiralniku)</w:t>
-      </w:r>
-    </w:p>
-    <w:p>
-      <w:pPr>
-        <w:ind w:left="283"/>
-      </w:pPr>
-      <w:r>
-        <w:rPr>
-          <w:b w:val="0"/>
-          <w:i w:val="0"/>
-        </w:rPr>
-        <w:t>☐  Ne, ker ne vem zanje</w:t>
-      </w:r>
-    </w:p>
-    <w:p>
-      <w:pPr>
-        <w:ind w:left="283"/>
-      </w:pPr>
-      <w:r>
-        <w:rPr>
-          <w:b w:val="0"/>
-          <w:i w:val="0"/>
-        </w:rPr>
-        <w:t>☐  Ne</w:t>
-      </w:r>
-    </w:p>
-    <w:p>
-      <w:pPr>
-        <w:ind w:left="283"/>
-      </w:pPr>
-      <w:r>
-        <w:rPr>
-          <w:b w:val="0"/>
-          <w:i w:val="0"/>
-        </w:rPr>
-        <w:t>☐  Sem najemnik(-ca)</w:t>
-      </w:r>
-    </w:p>
-    <w:p>
-      <w:pPr>
-        <w:spacing w:before="120"/>
-      </w:pPr>
-      <w:r>
-        <w:rPr>
-          <w:b w:val="0"/>
-          <w:i/>
-        </w:rPr>
-        <w:t>► Če niste odgovorili »Redno« ali »Sem najemnik(-ca)«:</w:t>
-      </w:r>
-    </w:p>
-    <w:p>
-      <w:pPr>
-        <w:keepNext/>
-        <w:spacing w:before="80"/>
-      </w:pPr>
-      <w:r>
-        <w:rPr>
-          <w:b/>
-          <w:i w:val="0"/>
-        </w:rPr>
-        <w:t>Kaj bi vam pomagalo, da bi prišli?</w:t>
-      </w:r>
-    </w:p>
-    <w:p>
-      <w:pPr>
-        <w:keepNext/>
-      </w:pPr>
-      <w:r>
-        <w:rPr>
-          <w:b w:val="0"/>
-          <w:i/>
-          <w:sz w:val="20"/>
-        </w:rPr>
-        <w:t>Izberete lahko več odgovorov.</w:t>
-      </w:r>
-    </w:p>
-    <w:p>
-      <w:pPr>
-        <w:ind w:left="283"/>
-      </w:pPr>
-      <w:r>
-        <w:rPr>
-          <w:b w:val="0"/>
-          <w:i w:val="0"/>
-        </w:rPr>
-        <w:t>☐  boljše obveščanje</w:t>
-      </w:r>
-    </w:p>
-    <w:p>
-      <w:pPr>
-        <w:ind w:left="283"/>
-      </w:pPr>
-      <w:r>
-        <w:rPr>
-          <w:b w:val="0"/>
-          <w:i w:val="0"/>
-        </w:rPr>
-        <w:t>☐  obvestilo na oglasni deski v vhodu</w:t>
-      </w:r>
-    </w:p>
-    <w:p>
-      <w:pPr>
-        <w:ind w:left="283"/>
-      </w:pPr>
-      <w:r>
-        <w:rPr>
-          <w:b w:val="0"/>
-          <w:i w:val="0"/>
-        </w:rPr>
-        <w:t>☐  primernejša ura</w:t>
-      </w:r>
-    </w:p>
-    <w:p>
-      <w:pPr>
-        <w:ind w:left="283"/>
-      </w:pPr>
-      <w:r>
-        <w:rPr>
-          <w:b w:val="0"/>
-          <w:i w:val="0"/>
-        </w:rPr>
-        <w:t>☐  krajši zbori</w:t>
-      </w:r>
-    </w:p>
-    <w:p>
-      <w:pPr>
-        <w:ind w:left="283"/>
-      </w:pPr>
-      <w:r>
-        <w:rPr>
-          <w:b w:val="0"/>
-          <w:i w:val="0"/>
-        </w:rPr>
-        <w:t>☐  spletna udeležba</w:t>
-      </w:r>
-    </w:p>
-    <w:p>
-      <w:pPr>
-        <w:ind w:left="283"/>
-      </w:pPr>
-      <w:r>
-        <w:rPr>
-          <w:b w:val="0"/>
-          <w:i w:val="0"/>
-        </w:rPr>
-        <w:t>☐  glasovanje na daljavo / e-glasovanje</w:t>
-      </w:r>
-    </w:p>
-    <w:p>
-      <w:pPr>
-        <w:ind w:left="283"/>
-      </w:pPr>
-      <w:r>
-        <w:rPr>
-          <w:b w:val="0"/>
-          <w:i w:val="0"/>
-        </w:rPr>
-        <w:t>☐  drugo</w:t>
-      </w:r>
-    </w:p>
-    <w:p>
-      <w:pPr>
-        <w:keepNext/>
-        <w:spacing w:before="160"/>
-      </w:pPr>
-      <w:r>
-        <w:rPr>
-          <w:b/>
-          <w:i w:val="0"/>
-        </w:rPr>
-        <w:t>Ali bi bili pripravljeni biti predstavnik/-ca vhoda?</w:t>
-      </w:r>
-    </w:p>
-    <w:p>
-      <w:pPr>
-        <w:ind w:left="283"/>
-      </w:pPr>
-      <w:r>
-        <w:rPr>
-          <w:b w:val="0"/>
-          <w:i w:val="0"/>
-        </w:rPr>
-        <w:t>☐  Da     ☐  Morda     ☐  Ne</w:t>
-      </w:r>
-    </w:p>
-    <w:p>
-      <w:r>
-        <w:rPr>
-          <w:b w:val="0"/>
-          <w:i/>
-        </w:rPr>
-        <w:t>Če ste odgovorili »Da« ali »Morda«: Hvala! Da anketa ostane anonimna, kontakta tu ne zbiramo. Na koncu je ločen modri listek (kontaktni obrazec), ki z odgovori ni povezan.</w:t>
-      </w:r>
-    </w:p>
-    <w:p>
-      <w:pPr>
-        <w:pStyle w:val="Heading2"/>
-        <w:keepNext/>
-      </w:pPr>
-      <w:r>
-        <w:t>10. Zdravstvo</w:t>
-      </w:r>
-    </w:p>
-    <w:p>
-      <w:pPr>
-        <w:keepNext/>
-      </w:pPr>
-      <w:r>
-        <w:t>Za vse (razen mlajših od 15 let)</w:t>
-      </w:r>
-    </w:p>
-    <w:p>
-      <w:pPr>
-        <w:keepNext/>
-      </w:pPr>
-      <w:r>
-        <w:t>Vsa vprašanja so neobvezna. Sprašujemo samo o dostopu, ne o boleznih ali politiki.</w:t>
-      </w:r>
-    </w:p>
-    <w:p>
-      <w:pPr>
-        <w:keepNext/>
-      </w:pPr>
-      <w:r>
-        <w:t>Kako ste zadovoljni z dostopom do zdravstvenih storitev v bližini?</w:t>
-      </w:r>
-    </w:p>
-    <w:p>
-      <w:pPr>
-        <w:keepNext/>
-      </w:pPr>
-      <w:r>
-        <w:t>1 = zelo slabo, 5 = zelo dobro.</w:t>
-      </w:r>
-    </w:p>
-    <w:p>
-      <w:pPr>
-        <w:keepNext/>
-      </w:pPr>
-      <w:r>
-        <w:t>☐  1     ☐  2     ☐  3     ☐  4     ☐  5     ☐  Ne uporabljam</w:t>
-      </w:r>
-    </w:p>
-    <w:p>
-      <w:pPr>
-        <w:keepNext/>
-      </w:pPr>
-      <w:r>
-        <w:t>Kaj vam najbolj manjka? (lahko več)</w:t>
-      </w:r>
-    </w:p>
-    <w:p>
-      <w:pPr>
-        <w:keepNext/>
-      </w:pPr>
-      <w:r>
-        <w:t>☐  Osebni zdravnik     ☐  Pediater     ☐  Zobozdravnik</w:t>
-      </w:r>
-    </w:p>
-    <w:p>
-      <w:pPr>
-        <w:keepNext/>
-      </w:pPr>
-      <w:r>
-        <w:t>☐  Specialisti     ☐  Urgenca / dežurna služba     ☐  Nič</w:t>
-      </w:r>
-    </w:p>
-    <w:p>
-      <w:pPr>
-        <w:pStyle w:val="Heading2"/>
-        <w:keepNext/>
-      </w:pPr>
-      <w:r>
-        <w:t>11. Koliko ste stari?</w:t>
-      </w:r>
-    </w:p>
-    <w:p>
-      <w:r>
-        <w:rPr>
-          <w:b w:val="0"/>
-          <w:i/>
-          <w:sz w:val="18"/>
-        </w:rPr>
-        <w:t>O vas</w:t>
-      </w:r>
-    </w:p>
-    <w:p>
-      <w:r>
-        <w:rPr>
-          <w:b w:val="0"/>
-          <w:i w:val="0"/>
-        </w:rPr>
-        <w:t>Glede na starost izpolnite še kratka vprašanja za svojo starostno skupino (14. in 15. korak).</w:t>
-      </w:r>
-    </w:p>
-    <w:p>
-      <w:pPr>
-        <w:ind w:left="283"/>
-      </w:pPr>
-      <w:r>
-        <w:rPr>
-          <w:b w:val="0"/>
-          <w:i w:val="0"/>
-        </w:rPr>
-        <w:t>☐  mlajši od 15 let     ☐  15–24     ☐  25–34     ☐  35–49</w:t>
-      </w:r>
-    </w:p>
-    <w:p>
-      <w:pPr>
-        <w:ind w:left="283"/>
-      </w:pPr>
-      <w:r>
-        <w:rPr>
-          <w:b w:val="0"/>
-          <w:i w:val="0"/>
-        </w:rPr>
-        <w:t>☐  50–64     ☐  65–74     ☐  75 ali več</w:t>
-      </w:r>
-    </w:p>
-    <w:p>
-      <w:r>
-        <w:rPr>
-          <w:b w:val="0"/>
-          <w:i/>
-        </w:rPr>
-        <w:t>Če ste mlajši od 15 let: Hvala, ker te zanima naše naselje! Ta anketa je za prebivalce od 15. leta naprej. Otroke bomo vprašali v šoli: v razredu boste skupaj glasovali, kaj bi v naselju spremenili. Lahko pa že zdaj staršem poveš, kaj si želiš. Oni lahko to zapišejo v svojo anketo.</w:t>
-      </w:r>
-    </w:p>
-    <w:p>
-      <w:pPr>
-        <w:pStyle w:val="Heading2"/>
-        <w:keepNext/>
-      </w:pPr>
-      <w:r>
-        <w:t>12. Kje in kako živite?</w:t>
-      </w:r>
-    </w:p>
-    <w:p>
-      <w:r>
-        <w:rPr>
-          <w:b w:val="0"/>
-          <w:i/>
-          <w:sz w:val="18"/>
-        </w:rPr>
-        <w:t>O vas</w:t>
-      </w:r>
-    </w:p>
-    <w:p>
-      <w:pPr>
-        <w:keepNext/>
-        <w:spacing w:before="160"/>
-      </w:pPr>
-      <w:r>
-        <w:rPr>
-          <w:b/>
-          <w:i w:val="0"/>
-        </w:rPr>
-        <w:t>Na kateri ulici živite?</w:t>
-      </w:r>
-    </w:p>
-    <w:p>
-      <w:pPr>
-        <w:keepNext/>
-      </w:pPr>
-      <w:r>
-        <w:rPr>
-          <w:b w:val="0"/>
-          <w:i/>
-          <w:sz w:val="20"/>
-        </w:rPr>
-        <w:t>Podatek o ulici nam pomaga preveriti, ali so v anketi zastopani prebivalci vseh delov naselja. Hišne številke ne zbiramo.</w:t>
-      </w:r>
-    </w:p>
-    <w:p>
-      <w:pPr>
-        <w:ind w:left="283"/>
-      </w:pPr>
-      <w:r>
-        <w:rPr>
-          <w:b w:val="0"/>
-          <w:i w:val="0"/>
-        </w:rPr>
-        <w:t>☐  Belokranjska     ☐  Dečkova ploščad     ☐  Endliherjeva</w:t>
-      </w:r>
-    </w:p>
-    <w:p>
-      <w:pPr>
-        <w:ind w:left="283"/>
-      </w:pPr>
-      <w:r>
-        <w:rPr>
-          <w:b w:val="0"/>
-          <w:i w:val="0"/>
-        </w:rPr>
-        <w:t>☐  Fabianijeva     ☐  Knobleharjeva     ☐  Linhartova</w:t>
-      </w:r>
-    </w:p>
-    <w:p>
-      <w:pPr>
-        <w:ind w:left="283"/>
-      </w:pPr>
-      <w:r>
-        <w:rPr>
-          <w:b w:val="0"/>
-          <w:i w:val="0"/>
-        </w:rPr>
-        <w:t>☐  Luize Pesjakove     ☐  Majaronova     ☐  Matjaževa</w:t>
-      </w:r>
-    </w:p>
-    <w:p>
-      <w:pPr>
-        <w:ind w:left="283"/>
-      </w:pPr>
-      <w:r>
-        <w:rPr>
-          <w:b w:val="0"/>
-          <w:i w:val="0"/>
-        </w:rPr>
-        <w:t>☐  Mikuževa     ☐  Mislejeva     ☐  Savska</w:t>
-      </w:r>
-    </w:p>
-    <w:p>
-      <w:pPr>
-        <w:ind w:left="283"/>
-      </w:pPr>
-      <w:r>
-        <w:rPr>
-          <w:b w:val="0"/>
-          <w:i w:val="0"/>
-        </w:rPr>
-        <w:t>☐  Šerkova     ☐  Topniška     ☐  drugo</w:t>
-      </w:r>
-    </w:p>
-    <w:p>
-      <w:pPr>
-        <w:keepNext/>
-        <w:spacing w:before="160"/>
-      </w:pPr>
-      <w:r>
-        <w:rPr>
-          <w:b/>
-          <w:i w:val="0"/>
-        </w:rPr>
-        <w:t>V stanovanju živite kot:</w:t>
-      </w:r>
-    </w:p>
-    <w:p>
-      <w:pPr>
-        <w:ind w:left="283"/>
-      </w:pPr>
-      <w:r>
-        <w:rPr>
-          <w:b w:val="0"/>
-          <w:i w:val="0"/>
-        </w:rPr>
-        <w:t>☐  lastnik ali družinski član lastnika</w:t>
-      </w:r>
-    </w:p>
-    <w:p>
-      <w:pPr>
-        <w:ind w:left="283"/>
-      </w:pPr>
-      <w:r>
-        <w:rPr>
-          <w:b w:val="0"/>
-          <w:i w:val="0"/>
-        </w:rPr>
-        <w:t>☐  najemnik pri JSS MOL (neprofitno)</w:t>
-      </w:r>
-    </w:p>
-    <w:p>
-      <w:pPr>
-        <w:ind w:left="283"/>
-      </w:pPr>
-      <w:r>
-        <w:rPr>
-          <w:b w:val="0"/>
-          <w:i w:val="0"/>
-        </w:rPr>
-        <w:t>☐  najemnik pri zasebniku</w:t>
-      </w:r>
-    </w:p>
-    <w:p>
-      <w:pPr>
-        <w:ind w:left="283"/>
-      </w:pPr>
-      <w:r>
-        <w:rPr>
-          <w:b w:val="0"/>
-          <w:i w:val="0"/>
-        </w:rPr>
-        <w:t>☐  drugo</w:t>
-      </w:r>
-    </w:p>
-    <w:p>
-      <w:pPr>
-        <w:ind w:left="283"/>
-      </w:pPr>
-      <w:r>
-        <w:rPr>
-          <w:b w:val="0"/>
-          <w:i w:val="0"/>
-        </w:rPr>
-        <w:t>☐  Ne želim odgovoriti</w:t>
-      </w:r>
-    </w:p>
-    <w:p>
-      <w:pPr>
-        <w:keepNext/>
-        <w:spacing w:before="160"/>
-      </w:pPr>
-      <w:r>
-        <w:rPr>
-          <w:b/>
-          <w:i w:val="0"/>
-        </w:rPr>
-        <w:t>Ima vaš blok (vhod) dvigalo?</w:t>
+        <w:t>Če bi zboleli in potrebovali nakup ali zdravila, imate v bližini koga poklicati?</w:t>
       </w:r>
     </w:p>
     <w:p>
@@ -2301,47 +2640,32 @@
     </w:p>
     <w:p>
       <w:pPr>
-        <w:pStyle w:val="Heading2"/>
-        <w:keepNext/>
-      </w:pPr>
-      <w:r>
-        <w:t>13. Promet na vaši ulici</w:t>
-      </w:r>
-    </w:p>
-    <w:p>
-      <w:r>
-        <w:rPr>
-          <w:b w:val="0"/>
-          <w:i/>
-          <w:sz w:val="18"/>
-        </w:rPr>
-        <w:t>Za vse</w:t>
-      </w:r>
-    </w:p>
-    <w:p>
-      <w:pPr>
-        <w:keepNext/>
-        <w:spacing w:before="160"/>
-      </w:pPr>
+        <w:pStyle w:val="Heading3"/>
+      </w:pPr>
+      <w:r>
+        <w:t>Za 25 do 64 let (25–34, 35–49, 50–64)</w:t>
+      </w:r>
+    </w:p>
+    <w:p>
       <w:r>
         <w:rPr>
           <w:b/>
           <w:i w:val="0"/>
         </w:rPr>
-        <w:t>Bi podprli enosmerni promet na svoji ulici?</w:t>
+        <w:t>13. Vrtec in šola</w:t>
       </w:r>
     </w:p>
     <w:p>
       <w:pPr>
         <w:keepNext/>
+        <w:spacing w:before="160"/>
       </w:pPr>
       <w:r>
         <w:rPr>
-          <w:b w:val="0"/>
-          <w:i/>
-          <w:sz w:val="20"/>
+          <w:b/>
+          <w:i w:val="0"/>
         </w:rPr>
-        <w:t>Vaš odgovor ne pomeni uradne zaveze. Pomaga nam razumeti, kako stanovalci posameznih ulic gledajo na uvedbo enosmernega prometa.</w:t>
+        <w:t>Imate otroke v vrtcu ali osnovni šoli?</w:t>
       </w:r>
     </w:p>
     <w:p>
@@ -2353,41 +2677,44 @@
           <w:b w:val="0"/>
           <w:i w:val="0"/>
         </w:rPr>
-        <w:t>☐  da     ☐  ne     ☐  ne vem</w:t>
-      </w:r>
-    </w:p>
-    <w:p>
-      <w:pPr>
-        <w:pStyle w:val="Heading2"/>
-      </w:pPr>
-      <w:r>
-        <w:t>14.–15. Vprašanja za vašo starostno skupino</w:t>
-      </w:r>
-    </w:p>
-    <w:p>
+        <w:t>☐  da     ☐  ne</w:t>
+      </w:r>
+    </w:p>
+    <w:p>
+      <w:pPr>
+        <w:spacing w:before="120"/>
+      </w:pPr>
       <w:r>
         <w:rPr>
           <w:b w:val="0"/>
           <w:i/>
         </w:rPr>
-        <w:t>Izpolnite samo del za svojo starostno skupino.</w:t>
-      </w:r>
-    </w:p>
-    <w:p>
-      <w:pPr>
-        <w:pStyle w:val="Heading3"/>
-      </w:pPr>
-      <w:r>
-        <w:t>Za 65 let in več (65–74, 75 ali več)</w:t>
-      </w:r>
-    </w:p>
-    <w:p>
+        <w:t>► Če ste odgovorili »da«:</w:t>
+      </w:r>
+    </w:p>
+    <w:p>
+      <w:pPr>
+        <w:keepNext/>
+        <w:spacing w:before="80"/>
+      </w:pPr>
       <w:r>
         <w:rPr>
           <w:b/>
           <w:i w:val="0"/>
         </w:rPr>
-        <w:t>14. Stopnice, dvigala in klopi</w:t>
+        <w:t>Kako varna je pot v vrtec ali šolo?</w:t>
+      </w:r>
+    </w:p>
+    <w:p>
+      <w:pPr>
+        <w:ind w:left="283"/>
+      </w:pPr>
+      <w:r>
+        <w:rPr>
+          <w:b w:val="0"/>
+          <w:i w:val="0"/>
+        </w:rPr>
+        <w:t>☐  zelo varna     ☐  kar varna     ☐  ne preveč varna     ☐  nevarna</w:t>
       </w:r>
     </w:p>
     <w:p>
@@ -2399,7 +2726,7 @@
           <w:b w:val="0"/>
           <w:i/>
         </w:rPr>
-        <w:t>► Če vaš blok (vhod) nima dvigala ali ne veste:</w:t>
+        <w:t>► Če ste odgovorili »da«:</w:t>
       </w:r>
     </w:p>
     <w:p>
@@ -2412,106 +2739,7 @@
           <w:b/>
           <w:i w:val="0"/>
         </w:rPr>
-        <w:t>Vam ali komu v gospodinjstvu stopnice otežujejo vsakdan?</w:t>
-      </w:r>
-    </w:p>
-    <w:p>
-      <w:pPr>
-        <w:ind w:left="283"/>
-      </w:pPr>
-      <w:r>
-        <w:rPr>
-          <w:b w:val="0"/>
-          <w:i w:val="0"/>
-        </w:rPr>
-        <w:t>☐  pogosto     ☐  včasih     ☐  ne</w:t>
-      </w:r>
-    </w:p>
-    <w:p>
-      <w:pPr>
-        <w:spacing w:before="120"/>
-      </w:pPr>
-      <w:r>
-        <w:rPr>
-          <w:b w:val="0"/>
-          <w:i/>
-        </w:rPr>
-        <w:t>► Če vaš blok (vhod) nima dvigala ali ne veste:</w:t>
-      </w:r>
-    </w:p>
-    <w:p>
-      <w:pPr>
-        <w:keepNext/>
-        <w:spacing w:before="80"/>
-      </w:pPr>
-      <w:r>
-        <w:rPr>
-          <w:b/>
-          <w:i w:val="0"/>
-        </w:rPr>
-        <w:t>Bi podprli vgradnjo dvigala v vašem vhodu?</w:t>
-      </w:r>
-    </w:p>
-    <w:p>
-      <w:pPr>
-        <w:ind w:left="283"/>
-      </w:pPr>
-      <w:r>
-        <w:rPr>
-          <w:b w:val="0"/>
-          <w:i w:val="0"/>
-        </w:rPr>
-        <w:t>☐  da, tudi z lastnim deležem stroškov     ☐  da, če večino plača subvencija</w:t>
-      </w:r>
-    </w:p>
-    <w:p>
-      <w:pPr>
-        <w:ind w:left="283"/>
-      </w:pPr>
-      <w:r>
-        <w:rPr>
-          <w:b w:val="0"/>
-          <w:i w:val="0"/>
-        </w:rPr>
-        <w:t>☐  ne     ☐  ne vem</w:t>
-      </w:r>
-    </w:p>
-    <w:p>
-      <w:pPr>
-        <w:keepNext/>
-        <w:spacing w:before="160"/>
-      </w:pPr>
-      <w:r>
-        <w:rPr>
-          <w:b/>
-          <w:i w:val="0"/>
-        </w:rPr>
-        <w:t>Ali na poteh, ki jih pogosto prehodite, pogrešate klop za počitek?</w:t>
-      </w:r>
-    </w:p>
-    <w:p>
-      <w:pPr>
-        <w:ind w:left="283"/>
-      </w:pPr>
-      <w:r>
-        <w:rPr>
-          <w:b w:val="0"/>
-          <w:i w:val="0"/>
-        </w:rPr>
-        <w:t>☐  da, pogosto     ☐  včasih     ☐  ne</w:t>
-      </w:r>
-    </w:p>
-    <w:p>
-      <w:pPr>
-        <w:keepNext/>
-        <w:spacing w:before="160"/>
-      </w:pPr>
-      <w:r>
-        <w:rPr>
-          <w:b/>
-          <w:i w:val="0"/>
-        </w:rPr>
-        <w:t>Kje bi klop najbolj prav prišla?</w:t>
+        <w:t>Kje je na tej poti najbolj nevarno?</w:t>
       </w:r>
     </w:p>
     <w:p>
@@ -2545,245 +2773,7 @@
           <w:b/>
           <w:i w:val="0"/>
         </w:rPr>
-        <w:t>15. Vsakdan in sosedje</w:t>
-      </w:r>
-    </w:p>
-    <w:p>
-      <w:pPr>
-        <w:keepNext/>
-        <w:spacing w:before="160"/>
-      </w:pPr>
-      <w:r>
-        <w:rPr>
-          <w:b/>
-          <w:i w:val="0"/>
-        </w:rPr>
-        <w:t>Kako pridete do trgovine?</w:t>
-      </w:r>
-    </w:p>
-    <w:p>
-      <w:pPr>
-        <w:ind w:left="283"/>
-      </w:pPr>
-      <w:r>
-        <w:rPr>
-          <w:b w:val="0"/>
-          <w:i w:val="0"/>
-        </w:rPr>
-        <w:t>☐  brez težav     ☐  s težavo     ☐  sam(a) ne morem</w:t>
-      </w:r>
-    </w:p>
-    <w:p>
-      <w:pPr>
-        <w:keepNext/>
-        <w:spacing w:before="160"/>
-      </w:pPr>
-      <w:r>
-        <w:rPr>
-          <w:b/>
-          <w:i w:val="0"/>
-        </w:rPr>
-        <w:t>Kako pridete do zdravnika ali lekarne?</w:t>
-      </w:r>
-    </w:p>
-    <w:p>
-      <w:pPr>
-        <w:ind w:left="283"/>
-      </w:pPr>
-      <w:r>
-        <w:rPr>
-          <w:b w:val="0"/>
-          <w:i w:val="0"/>
-        </w:rPr>
-        <w:t>☐  brez težav     ☐  s težavo     ☐  sam(a) ne morem</w:t>
-      </w:r>
-    </w:p>
-    <w:p>
-      <w:pPr>
-        <w:keepNext/>
-        <w:spacing w:before="160"/>
-      </w:pPr>
-      <w:r>
-        <w:rPr>
-          <w:b/>
-          <w:i w:val="0"/>
-        </w:rPr>
-        <w:t>Koliko dni v tednu se s kom pogovarjate, v živo ali po telefonu?</w:t>
-      </w:r>
-    </w:p>
-    <w:p>
-      <w:pPr>
-        <w:ind w:left="283"/>
-      </w:pPr>
-      <w:r>
-        <w:rPr>
-          <w:b w:val="0"/>
-          <w:i w:val="0"/>
-        </w:rPr>
-        <w:t>☐  vsak dan     ☐  3–6 dni     ☐  1–2 dni     ☐  manj kot enkrat na teden</w:t>
-      </w:r>
-    </w:p>
-    <w:p>
-      <w:pPr>
-        <w:keepNext/>
-        <w:spacing w:before="160"/>
-      </w:pPr>
-      <w:r>
-        <w:rPr>
-          <w:b/>
-          <w:i w:val="0"/>
-        </w:rPr>
-        <w:t>Če bi zboleli in potrebovali nakup ali zdravila, imate v bližini koga poklicati?</w:t>
-      </w:r>
-    </w:p>
-    <w:p>
-      <w:pPr>
-        <w:ind w:left="283"/>
-      </w:pPr>
-      <w:r>
-        <w:rPr>
-          <w:b w:val="0"/>
-          <w:i w:val="0"/>
-        </w:rPr>
-        <w:t>☐  da     ☐  ne     ☐  ne vem</w:t>
-      </w:r>
-    </w:p>
-    <w:p>
-      <w:pPr>
-        <w:pStyle w:val="Heading3"/>
-      </w:pPr>
-      <w:r>
-        <w:t>Za 25 do 64 let (25–34, 35–49, 50–64)</w:t>
-      </w:r>
-    </w:p>
-    <w:p>
-      <w:r>
-        <w:rPr>
-          <w:b/>
-          <w:i w:val="0"/>
-        </w:rPr>
-        <w:t>14. Vrtec in šola</w:t>
-      </w:r>
-    </w:p>
-    <w:p>
-      <w:pPr>
-        <w:keepNext/>
-        <w:spacing w:before="160"/>
-      </w:pPr>
-      <w:r>
-        <w:rPr>
-          <w:b/>
-          <w:i w:val="0"/>
-        </w:rPr>
-        <w:t>Imate otroke v vrtcu ali osnovni šoli?</w:t>
-      </w:r>
-    </w:p>
-    <w:p>
-      <w:pPr>
-        <w:ind w:left="283"/>
-      </w:pPr>
-      <w:r>
-        <w:rPr>
-          <w:b w:val="0"/>
-          <w:i w:val="0"/>
-        </w:rPr>
-        <w:t>☐  da     ☐  ne</w:t>
-      </w:r>
-    </w:p>
-    <w:p>
-      <w:pPr>
-        <w:spacing w:before="120"/>
-      </w:pPr>
-      <w:r>
-        <w:rPr>
-          <w:b w:val="0"/>
-          <w:i/>
-        </w:rPr>
-        <w:t>► Če ste odgovorili »da«:</w:t>
-      </w:r>
-    </w:p>
-    <w:p>
-      <w:pPr>
-        <w:keepNext/>
-        <w:spacing w:before="80"/>
-      </w:pPr>
-      <w:r>
-        <w:rPr>
-          <w:b/>
-          <w:i w:val="0"/>
-        </w:rPr>
-        <w:t>Kako varna je pot v vrtec ali šolo?</w:t>
-      </w:r>
-    </w:p>
-    <w:p>
-      <w:pPr>
-        <w:ind w:left="283"/>
-      </w:pPr>
-      <w:r>
-        <w:rPr>
-          <w:b w:val="0"/>
-          <w:i w:val="0"/>
-        </w:rPr>
-        <w:t>☐  zelo varna     ☐  kar varna     ☐  ne preveč varna     ☐  nevarna</w:t>
-      </w:r>
-    </w:p>
-    <w:p>
-      <w:pPr>
-        <w:spacing w:before="120"/>
-      </w:pPr>
-      <w:r>
-        <w:rPr>
-          <w:b w:val="0"/>
-          <w:i/>
-        </w:rPr>
-        <w:t>► Če ste odgovorili »da«:</w:t>
-      </w:r>
-    </w:p>
-    <w:p>
-      <w:pPr>
-        <w:keepNext/>
-        <w:spacing w:before="80"/>
-      </w:pPr>
-      <w:r>
-        <w:rPr>
-          <w:b/>
-          <w:i w:val="0"/>
-        </w:rPr>
-        <w:t>Kje je na tej poti najbolj nevarno?</w:t>
-      </w:r>
-    </w:p>
-    <w:p>
-      <w:pPr>
-        <w:spacing w:after="160"/>
-      </w:pPr>
-      <w:r>
-        <w:rPr>
-          <w:b w:val="0"/>
-          <w:i w:val="0"/>
-        </w:rPr>
-        <w:t>______________________________________________________________________________________</w:t>
-      </w:r>
-    </w:p>
-    <w:p>
-      <w:r>
-        <w:rPr>
-          <w:b w:val="0"/>
-          <w:i/>
-          <w:sz w:val="18"/>
-        </w:rPr>
-        <w:t>Prosimo, ne navajajte imen drugih oseb.</w:t>
-      </w:r>
-    </w:p>
-    <w:p>
-      <w:pPr>
-        <w:spacing w:before="160"/>
-      </w:pPr>
-      <w:r>
-        <w:rPr>
-          <w:b/>
-          <w:i w:val="0"/>
-        </w:rPr>
-        <w:t>15. Dom skupnosti</w:t>
+        <w:t>14. Dom skupnosti</w:t>
       </w:r>
     </w:p>
     <w:p>

</xml_diff>

<commit_message>
Čistilni četrtek: novo vprašanje, 5 možnosti + Drugo z dopisom (shrani v cistilni_cetrtek kot 'Drugo: …'); Word usklajen
</commit_message>
<xml_diff>
--- a/savska-anketa-papir.docx
+++ b/savska-anketa-papir.docx
@@ -1076,7 +1076,7 @@
           <w:b/>
           <w:i w:val="0"/>
         </w:rPr>
-        <w:t>Ali podpirate Čistilni četrtek, ko bi vsi prebivalci skupaj in prostovoljno enkrat na teden očistili Savsko naselje?</w:t>
+        <w:t>Ali podpirate čistilne akcije (Čistilni četrtek), ko bi vsi prebivalci skupaj očistili Savsko naselje?</w:t>
       </w:r>
     </w:p>
     <w:p>
@@ -1089,7 +1089,7 @@
           <w:i/>
           <w:sz w:val="20"/>
         </w:rPr>
-        <w:t>Neobvezno.</w:t>
+        <w:t>Neobvezno. Obkrožite en odgovor.</w:t>
       </w:r>
     </w:p>
     <w:p>
@@ -1101,7 +1101,55 @@
           <w:b w:val="0"/>
           <w:i w:val="0"/>
         </w:rPr>
-        <w:t>☐  Da, podpiram     ☐  Morda     ☐  Ne</w:t>
+        <w:t>☐  Da, podpiram 1-krat na mesec</w:t>
+      </w:r>
+    </w:p>
+    <w:p>
+      <w:pPr>
+        <w:ind w:left="283"/>
+      </w:pPr>
+      <w:r>
+        <w:rPr>
+          <w:b w:val="0"/>
+          <w:i w:val="0"/>
+        </w:rPr>
+        <w:t>☐  Da, podpiram 1-krat na teden</w:t>
+      </w:r>
+    </w:p>
+    <w:p>
+      <w:pPr>
+        <w:ind w:left="283"/>
+      </w:pPr>
+      <w:r>
+        <w:rPr>
+          <w:b w:val="0"/>
+          <w:i w:val="0"/>
+        </w:rPr>
+        <w:t>☐  Da, podpiram 1-krat na leto</w:t>
+      </w:r>
+    </w:p>
+    <w:p>
+      <w:pPr>
+        <w:ind w:left="283"/>
+      </w:pPr>
+      <w:r>
+        <w:rPr>
+          <w:b w:val="0"/>
+          <w:i w:val="0"/>
+        </w:rPr>
+        <w:t>☐  Drugo: ______________________________________</w:t>
+      </w:r>
+    </w:p>
+    <w:p>
+      <w:pPr>
+        <w:ind w:left="283"/>
+      </w:pPr>
+      <w:r>
+        <w:rPr>
+          <w:b w:val="0"/>
+          <w:i w:val="0"/>
+        </w:rPr>
+        <w:t>☐  Ne podpiram</w:t>
       </w:r>
     </w:p>
     <w:p>

</xml_diff>

<commit_message>
Garaža: nakup z možnostjo Drugo (lasten opis) + novo vprašanje o najemu (mesečno) z Drugo; ključ garaza_najem (+ začasno v zdr_dvigalo); papirna različica
</commit_message>
<xml_diff>
--- a/savska-anketa-papir.docx
+++ b/savska-anketa-papir.docx
@@ -1436,6 +1436,67 @@
           <w:i w:val="0"/>
         </w:rPr>
         <w:t>☐  več kot 40.000 €     ☐  Ne želim odgovoriti</w:t>
+      </w:r>
+    </w:p>
+    <w:p>
+      <w:pPr>
+        <w:ind w:left="283"/>
+      </w:pPr>
+      <w:r>
+        <w:rPr>
+          <w:b w:val="0"/>
+          <w:i w:val="0"/>
+        </w:rPr>
+        <w:t>☐  Drugo – opišite sami (znesek ali pogoji): ______________________________</w:t>
+      </w:r>
+    </w:p>
+    <w:p>
+      <w:pPr>
+        <w:keepNext/>
+        <w:spacing w:before="80"/>
+      </w:pPr>
+      <w:r>
+        <w:rPr>
+          <w:b/>
+          <w:i w:val="0"/>
+        </w:rPr>
+        <w:t>Koliko bi bili pripravljeni plačati za najem (mesečno)?</w:t>
+      </w:r>
+    </w:p>
+    <w:p>
+      <w:pPr>
+        <w:ind w:left="283"/>
+      </w:pPr>
+      <w:r>
+        <w:rPr>
+          <w:b w:val="0"/>
+          <w:i w:val="0"/>
+        </w:rPr>
+        <w:t>☐  Le brezplačno     ☐  do 30 €     ☐  30–50 €     ☐  50–80 €</w:t>
+      </w:r>
+    </w:p>
+    <w:p>
+      <w:pPr>
+        <w:ind w:left="283"/>
+      </w:pPr>
+      <w:r>
+        <w:rPr>
+          <w:b w:val="0"/>
+          <w:i w:val="0"/>
+        </w:rPr>
+        <w:t>☐  80–120 €     ☐  več kot 120 €     ☐  Ne želim odgovoriti</w:t>
+      </w:r>
+    </w:p>
+    <w:p>
+      <w:pPr>
+        <w:ind w:left="283"/>
+      </w:pPr>
+      <w:r>
+        <w:rPr>
+          <w:b w:val="0"/>
+          <w:i w:val="0"/>
+        </w:rPr>
+        <w:t>☐  Drugo – opišite sami: ________ €/mesec ali pogoji: ____________________</w:t>
       </w:r>
     </w:p>
     <w:p>

</xml_diff>

<commit_message>
Garaža: nakup in najem samo z lastnim vpisom (brez razredov); papirna različica s črtama
</commit_message>
<xml_diff>
--- a/savska-anketa-papir.docx
+++ b/savska-anketa-papir.docx
@@ -1399,55 +1399,7 @@
           <w:b w:val="0"/>
           <w:i w:val="0"/>
         </w:rPr>
-        <w:t>☐  Le brezplačno     ☐  do 5.000 €</w:t>
-      </w:r>
-    </w:p>
-    <w:p>
-      <w:pPr>
-        <w:ind w:left="283"/>
-      </w:pPr>
-      <w:r>
-        <w:rPr>
-          <w:b w:val="0"/>
-          <w:i w:val="0"/>
-        </w:rPr>
-        <w:t>☐  5.000–10.000 €     ☐  10.000–20.000 €</w:t>
-      </w:r>
-    </w:p>
-    <w:p>
-      <w:pPr>
-        <w:ind w:left="283"/>
-      </w:pPr>
-      <w:r>
-        <w:rPr>
-          <w:b w:val="0"/>
-          <w:i w:val="0"/>
-        </w:rPr>
-        <w:t>☐  20.000–30.000 €     ☐  30.000–40.000 €</w:t>
-      </w:r>
-    </w:p>
-    <w:p>
-      <w:pPr>
-        <w:ind w:left="283"/>
-      </w:pPr>
-      <w:r>
-        <w:rPr>
-          <w:b w:val="0"/>
-          <w:i w:val="0"/>
-        </w:rPr>
-        <w:t>☐  več kot 40.000 €     ☐  Ne želim odgovoriti</w:t>
-      </w:r>
-    </w:p>
-    <w:p>
-      <w:pPr>
-        <w:ind w:left="283"/>
-      </w:pPr>
-      <w:r>
-        <w:rPr>
-          <w:b w:val="0"/>
-          <w:i w:val="0"/>
-        </w:rPr>
-        <w:t>☐  Drugo – opišite sami (znesek ali pogoji): ______________________________</w:t>
+        <w:t>Vpišite sami: ______________ € ali pogoji: ______________________________</w:t>
       </w:r>
     </w:p>
     <w:p>
@@ -1472,31 +1424,7 @@
           <w:b w:val="0"/>
           <w:i w:val="0"/>
         </w:rPr>
-        <w:t>☐  Le brezplačno     ☐  do 30 €     ☐  30–50 €     ☐  50–80 €</w:t>
-      </w:r>
-    </w:p>
-    <w:p>
-      <w:pPr>
-        <w:ind w:left="283"/>
-      </w:pPr>
-      <w:r>
-        <w:rPr>
-          <w:b w:val="0"/>
-          <w:i w:val="0"/>
-        </w:rPr>
-        <w:t>☐  80–120 €     ☐  več kot 120 €     ☐  Ne želim odgovoriti</w:t>
-      </w:r>
-    </w:p>
-    <w:p>
-      <w:pPr>
-        <w:ind w:left="283"/>
-      </w:pPr>
-      <w:r>
-        <w:rPr>
-          <w:b w:val="0"/>
-          <w:i w:val="0"/>
-        </w:rPr>
-        <w:t>☐  Drugo – opišite sami: ________ €/mesec ali pogoji: ____________________</w:t>
+        <w:t>Vpišite sami: ______________ €/mesec ali pogoji: ________________________</w:t>
       </w:r>
     </w:p>
     <w:p>

</xml_diff>

<commit_message>
Ohladitev: dodani Sem doma in Ven iz Ljubljane; papirna različica
</commit_message>
<xml_diff>
--- a/savska-anketa-papir.docx
+++ b/savska-anketa-papir.docx
@@ -1538,7 +1538,7 @@
         <w:keepNext/>
       </w:pPr>
       <w:r>
-        <w:t>☐  Park / senca pod drevesi     ☐  Dom skupnosti     ☐  Ob Savi</w:t>
+        <w:t>☐  Park / senca pod drevesi     ☐  Dom skupnosti     ☐  Ob Savi     ☐  Sem doma</w:t>
       </w:r>
     </w:p>
     <w:p>
@@ -1546,7 +1546,7 @@
         <w:keepNext/>
       </w:pPr>
       <w:r>
-        <w:t>☐  Nikamor / ne zadeva me     ☐  Drugo: _______________________________</w:t>
+        <w:t>☐  Ven iz Ljubljane     ☐  Nikamor / ne zadeva me     ☐  Drugo: _______________________________</w:t>
       </w:r>
     </w:p>
     <w:p>

</xml_diff>

<commit_message>
Odstranjen poštni naslov in dostava obvestil na dom (samo digitalno): obrazec, oddaja, zasebnost, papir; Code.gs obdelava naslova označena kot neuporabljena
</commit_message>
<xml_diff>
--- a/savska-anketa-papir.docx
+++ b/savska-anketa-papir.docx
@@ -3671,106 +3671,6 @@
                 <w:i w:val="0"/>
               </w:rPr>
               <w:t>☐  Soglašam, da upravljavec Rok Terkaj (terkaj@gmail.com, 051 367 363) te podatke uporablja samo za vabila k sodelovanju in obvestila, jih ne posreduje nikomur, hrani največ 24 mesecev od zadnjega stika in jih na mojo zahtevo izbriše. Pritožba: Informacijski pooblaščenec.</w:t>
-            </w:r>
-          </w:p>
-          <w:p>
-            <w:pPr>
-              <w:spacing w:after="100"/>
-            </w:pPr>
-            <w:r>
-              <w:rPr>
-                <w:b/>
-                <w:i w:val="0"/>
-                <w:color w:val="0B2A6B"/>
-                <w:sz w:val="24"/>
-              </w:rPr>
-              <w:t>Poštni naslov (neobvezno)</w:t>
-            </w:r>
-          </w:p>
-          <w:p>
-            <w:pPr>
-              <w:spacing w:after="100"/>
-            </w:pPr>
-            <w:r>
-              <w:rPr>
-                <w:b w:val="0"/>
-                <w:i/>
-              </w:rPr>
-              <w:t>Naslov potrebujemo samo, če želite, da vam obvestila ali tiskano gradivo prinesemo na dom. Če tega ne želite, ta del preskočite.</w:t>
-            </w:r>
-          </w:p>
-          <w:p>
-            <w:pPr>
-              <w:spacing w:after="100"/>
-            </w:pPr>
-            <w:r>
-              <w:rPr>
-                <w:b/>
-                <w:i w:val="0"/>
-              </w:rPr>
-              <w:t xml:space="preserve">Ulica in hišna številka: </w:t>
-            </w:r>
-            <w:r>
-              <w:rPr>
-                <w:b w:val="0"/>
-                <w:i w:val="0"/>
-              </w:rPr>
-              <w:t>________________________________________________</w:t>
-            </w:r>
-          </w:p>
-          <w:p>
-            <w:pPr>
-              <w:spacing w:after="100"/>
-            </w:pPr>
-            <w:r>
-              <w:rPr>
-                <w:b/>
-                <w:i w:val="0"/>
-              </w:rPr>
-              <w:t xml:space="preserve">Številka stanovanja in nadstropje (neobvezno): </w:t>
-            </w:r>
-            <w:r>
-              <w:rPr>
-                <w:b w:val="0"/>
-                <w:i w:val="0"/>
-              </w:rPr>
-              <w:t>____________________________</w:t>
-            </w:r>
-          </w:p>
-          <w:p>
-            <w:pPr>
-              <w:spacing w:after="100"/>
-            </w:pPr>
-            <w:r>
-              <w:rPr>
-                <w:b w:val="0"/>
-                <w:i w:val="0"/>
-              </w:rPr>
-              <w:t>☐  Prinesite mi obvestila na dom</w:t>
-            </w:r>
-          </w:p>
-          <w:p>
-            <w:pPr>
-              <w:spacing w:after="100"/>
-            </w:pPr>
-            <w:r>
-              <w:rPr>
-                <w:b w:val="0"/>
-                <w:i w:val="0"/>
-              </w:rPr>
-              <w:t>☐  Dovolim, da upravljavec Rok Terkaj moj poštni naslov uporabi samo za to, da mi obvestila osebno prinese na dom. Naslova ne bo dal nikomur drugemu; prostovoljec, ki raznaša, dobi le naslove na svoji poti. Naslov bo izbrisan, ko to privolitev prekličem, sicer najpozneje 24 mesecev po zadnjem stiku. To privolitev dajem posebej in neodvisno od zgornje.</w:t>
-            </w:r>
-          </w:p>
-          <w:p>
-            <w:pPr>
-              <w:spacing w:after="100"/>
-            </w:pPr>
-            <w:r>
-              <w:rPr>
-                <w:b w:val="0"/>
-                <w:i/>
-              </w:rPr>
-              <w:t>Brez te potrditve naslova ne pošljemo in ga ne shranimo.</w:t>
             </w:r>
           </w:p>
           <w:p>

</xml_diff>

<commit_message>
Papirna izvedba: samo kontakt za anketo
</commit_message>
<xml_diff>
--- a/savska-anketa-papir.docx
+++ b/savska-anketa-papir.docx
@@ -174,7 +174,7 @@
         <w:t xml:space="preserve">Kontakt: </w:t>
       </w:r>
       <w:r>
-        <w:t>za vprašanja se lahko obrnete na Roka Terkaja, terkaj@gmail.com, 051 367 363.</w:t>
+        <w:t>Rok Terkaj, savskonaselje1@gmail.com ali telefon/SMS 070 205 595</w:t>
       </w:r>
     </w:p>
     <w:p>
@@ -3670,7 +3670,7 @@
                 <w:b w:val="0"/>
                 <w:i w:val="0"/>
               </w:rPr>
-              <w:t>☐  Soglašam, da upravljavec Rok Terkaj (terkaj@gmail.com, 051 367 363) te podatke uporablja samo za vabila k sodelovanju in obvestila, jih ne posreduje nikomur, hrani največ 24 mesecev od zadnjega stika in jih na mojo zahtevo izbriše. Pritožba: Informacijski pooblaščenec.</w:t>
+              <w:t>☐  Soglašam, da upravljavec Rok Terkaj (savskonaselje1@gmail.com, 070 205 595) te podatke uporablja samo za vabila k sodelovanju in obvestila, jih ne posreduje nikomur, hrani največ 24 mesecev od zadnjega stika in jih na mojo zahtevo izbriše. Pritožba: Informacijski pooblaščenec.</w:t>
             </w:r>
           </w:p>
           <w:p>

</xml_diff>